<commit_message>
chore: cap nhat code len main
</commit_message>
<xml_diff>
--- a/LTM.docx
+++ b/LTM.docx
@@ -4,6 +4,7 @@
   <w:body>
     <w:p>
       <w:pPr>
+        <w:pStyle w:val="Heading1"/>
         <w:rPr>
           <w:b/>
           <w:bCs/>
@@ -873,6 +874,7 @@
     </w:p>
     <w:p>
       <w:r>
+        <w:lastRenderedPageBreak/>
         <w:t xml:space="preserve">│       │   └── admin/        </w:t>
       </w:r>
       <w:proofErr w:type="gramStart"/>
@@ -999,7 +1001,6 @@
           <w:b/>
           <w:bCs/>
         </w:rPr>
-        <w:lastRenderedPageBreak/>
         <w:t>Người</w:t>
       </w:r>
       <w:proofErr w:type="spellEnd"/>
@@ -2829,6 +2830,7 @@
           <w:b/>
           <w:bCs/>
         </w:rPr>
+        <w:lastRenderedPageBreak/>
         <w:t>Người</w:t>
       </w:r>
       <w:proofErr w:type="spellEnd"/>
@@ -3304,7 +3306,6 @@
           <w:b/>
           <w:bCs/>
         </w:rPr>
-        <w:lastRenderedPageBreak/>
         <w:t>Thuật</w:t>
       </w:r>
       <w:proofErr w:type="spellEnd"/>
@@ -5417,6 +5418,7 @@
           <w:b/>
           <w:bCs/>
         </w:rPr>
+        <w:lastRenderedPageBreak/>
         <w:t>Góc</w:t>
       </w:r>
       <w:proofErr w:type="spellEnd"/>
@@ -5952,7 +5954,6 @@
       </w:pPr>
       <w:proofErr w:type="spellStart"/>
       <w:r>
-        <w:lastRenderedPageBreak/>
         <w:t>Đa</w:t>
       </w:r>
       <w:proofErr w:type="spellEnd"/>
@@ -8022,6 +8023,7 @@
                 <w:b/>
                 <w:bCs/>
               </w:rPr>
+              <w:lastRenderedPageBreak/>
               <w:t xml:space="preserve">Thành </w:t>
             </w:r>
             <w:proofErr w:type="spellStart"/>
@@ -8350,7 +8352,6 @@
                 <w:b/>
                 <w:bCs/>
               </w:rPr>
-              <w:lastRenderedPageBreak/>
               <w:t>Người</w:t>
             </w:r>
             <w:proofErr w:type="spellEnd"/>
@@ -9611,6 +9612,2936 @@
         <w:t>.</w:t>
       </w:r>
     </w:p>
+    <w:p>
+      <w:pPr>
+        <w:pStyle w:val="Heading1"/>
+        <w:rPr>
+          <w:rFonts w:eastAsiaTheme="minorHAnsi" w:cstheme="minorBidi"/>
+          <w:b/>
+          <w:bCs/>
+          <w:color w:val="auto"/>
+          <w:sz w:val="24"/>
+          <w:szCs w:val="24"/>
+        </w:rPr>
+      </w:pPr>
+      <w:r>
+        <w:br w:type="column"/>
+      </w:r>
+      <w:proofErr w:type="spellStart"/>
+      <w:r>
+        <w:rPr>
+          <w:rFonts w:eastAsiaTheme="minorHAnsi" w:cstheme="minorBidi"/>
+          <w:b/>
+          <w:bCs/>
+          <w:color w:val="auto"/>
+          <w:sz w:val="24"/>
+          <w:szCs w:val="24"/>
+        </w:rPr>
+        <w:lastRenderedPageBreak/>
+        <w:t>Bước</w:t>
+      </w:r>
+      <w:proofErr w:type="spellEnd"/>
+      <w:r>
+        <w:rPr>
+          <w:rFonts w:eastAsiaTheme="minorHAnsi" w:cstheme="minorBidi"/>
+          <w:b/>
+          <w:bCs/>
+          <w:color w:val="auto"/>
+          <w:sz w:val="24"/>
+          <w:szCs w:val="24"/>
+        </w:rPr>
+        <w:t xml:space="preserve"> 1: </w:t>
+      </w:r>
+      <w:proofErr w:type="spellStart"/>
+      <w:r>
+        <w:rPr>
+          <w:rFonts w:eastAsiaTheme="minorHAnsi" w:cstheme="minorBidi"/>
+          <w:b/>
+          <w:bCs/>
+          <w:color w:val="auto"/>
+          <w:sz w:val="24"/>
+          <w:szCs w:val="24"/>
+        </w:rPr>
+        <w:t>Thêm</w:t>
+      </w:r>
+      <w:proofErr w:type="spellEnd"/>
+      <w:r>
+        <w:rPr>
+          <w:rFonts w:eastAsiaTheme="minorHAnsi" w:cstheme="minorBidi"/>
+          <w:b/>
+          <w:bCs/>
+          <w:color w:val="auto"/>
+          <w:sz w:val="24"/>
+          <w:szCs w:val="24"/>
+        </w:rPr>
+        <w:t xml:space="preserve"> 2 </w:t>
+      </w:r>
+      <w:proofErr w:type="spellStart"/>
+      <w:r>
+        <w:rPr>
+          <w:rFonts w:eastAsiaTheme="minorHAnsi" w:cstheme="minorBidi"/>
+          <w:b/>
+          <w:bCs/>
+          <w:color w:val="auto"/>
+          <w:sz w:val="24"/>
+          <w:szCs w:val="24"/>
+        </w:rPr>
+        <w:t>bạn</w:t>
+      </w:r>
+      <w:proofErr w:type="spellEnd"/>
+      <w:r>
+        <w:rPr>
+          <w:rFonts w:eastAsiaTheme="minorHAnsi" w:cstheme="minorBidi"/>
+          <w:b/>
+          <w:bCs/>
+          <w:color w:val="auto"/>
+          <w:sz w:val="24"/>
+          <w:szCs w:val="24"/>
+        </w:rPr>
+        <w:t xml:space="preserve"> kia </w:t>
+      </w:r>
+      <w:proofErr w:type="spellStart"/>
+      <w:r>
+        <w:rPr>
+          <w:rFonts w:eastAsiaTheme="minorHAnsi" w:cstheme="minorBidi"/>
+          <w:b/>
+          <w:bCs/>
+          <w:color w:val="auto"/>
+          <w:sz w:val="24"/>
+          <w:szCs w:val="24"/>
+        </w:rPr>
+        <w:t>vào</w:t>
+      </w:r>
+      <w:proofErr w:type="spellEnd"/>
+      <w:r>
+        <w:rPr>
+          <w:rFonts w:eastAsiaTheme="minorHAnsi" w:cstheme="minorBidi"/>
+          <w:b/>
+          <w:bCs/>
+          <w:color w:val="auto"/>
+          <w:sz w:val="24"/>
+          <w:szCs w:val="24"/>
+        </w:rPr>
+        <w:t xml:space="preserve"> </w:t>
+      </w:r>
+      <w:proofErr w:type="spellStart"/>
+      <w:r>
+        <w:rPr>
+          <w:rFonts w:eastAsiaTheme="minorHAnsi" w:cstheme="minorBidi"/>
+          <w:b/>
+          <w:bCs/>
+          <w:color w:val="auto"/>
+          <w:sz w:val="24"/>
+          <w:szCs w:val="24"/>
+        </w:rPr>
+        <w:t>làm</w:t>
+      </w:r>
+      <w:proofErr w:type="spellEnd"/>
+      <w:r>
+        <w:rPr>
+          <w:rFonts w:eastAsiaTheme="minorHAnsi" w:cstheme="minorBidi"/>
+          <w:b/>
+          <w:bCs/>
+          <w:color w:val="auto"/>
+          <w:sz w:val="24"/>
+          <w:szCs w:val="24"/>
+        </w:rPr>
+        <w:t xml:space="preserve"> </w:t>
+      </w:r>
+      <w:proofErr w:type="spellStart"/>
+      <w:r>
+        <w:rPr>
+          <w:rFonts w:eastAsiaTheme="minorHAnsi" w:cstheme="minorBidi"/>
+          <w:b/>
+          <w:bCs/>
+          <w:color w:val="auto"/>
+          <w:sz w:val="24"/>
+          <w:szCs w:val="24"/>
+        </w:rPr>
+        <w:t>cộng</w:t>
+      </w:r>
+      <w:proofErr w:type="spellEnd"/>
+      <w:r>
+        <w:rPr>
+          <w:rFonts w:eastAsiaTheme="minorHAnsi" w:cstheme="minorBidi"/>
+          <w:b/>
+          <w:bCs/>
+          <w:color w:val="auto"/>
+          <w:sz w:val="24"/>
+          <w:szCs w:val="24"/>
+        </w:rPr>
+        <w:t xml:space="preserve"> </w:t>
+      </w:r>
+      <w:proofErr w:type="spellStart"/>
+      <w:r>
+        <w:rPr>
+          <w:rFonts w:eastAsiaTheme="minorHAnsi" w:cstheme="minorBidi"/>
+          <w:b/>
+          <w:bCs/>
+          <w:color w:val="auto"/>
+          <w:sz w:val="24"/>
+          <w:szCs w:val="24"/>
+        </w:rPr>
+        <w:t>tác</w:t>
+      </w:r>
+      <w:proofErr w:type="spellEnd"/>
+      <w:r>
+        <w:rPr>
+          <w:rFonts w:eastAsiaTheme="minorHAnsi" w:cstheme="minorBidi"/>
+          <w:b/>
+          <w:bCs/>
+          <w:color w:val="auto"/>
+          <w:sz w:val="24"/>
+          <w:szCs w:val="24"/>
+        </w:rPr>
+        <w:t xml:space="preserve"> </w:t>
+      </w:r>
+      <w:proofErr w:type="spellStart"/>
+      <w:r>
+        <w:rPr>
+          <w:rFonts w:eastAsiaTheme="minorHAnsi" w:cstheme="minorBidi"/>
+          <w:b/>
+          <w:bCs/>
+          <w:color w:val="auto"/>
+          <w:sz w:val="24"/>
+          <w:szCs w:val="24"/>
+        </w:rPr>
+        <w:t>viên</w:t>
+      </w:r>
+      <w:proofErr w:type="spellEnd"/>
+      <w:r>
+        <w:rPr>
+          <w:rFonts w:eastAsiaTheme="minorHAnsi" w:cstheme="minorBidi"/>
+          <w:b/>
+          <w:bCs/>
+          <w:color w:val="auto"/>
+          <w:sz w:val="24"/>
+          <w:szCs w:val="24"/>
+        </w:rPr>
+        <w:t xml:space="preserve"> (Collaborators)</w:t>
+      </w:r>
+    </w:p>
+    <w:p>
+      <w:r>
+        <w:t xml:space="preserve">Hai </w:t>
+      </w:r>
+      <w:proofErr w:type="spellStart"/>
+      <w:r>
+        <w:t>bạn</w:t>
+      </w:r>
+      <w:proofErr w:type="spellEnd"/>
+      <w:r>
+        <w:t xml:space="preserve"> kia </w:t>
+      </w:r>
+      <w:proofErr w:type="spellStart"/>
+      <w:r>
+        <w:t>cần</w:t>
+      </w:r>
+      <w:proofErr w:type="spellEnd"/>
+      <w:r>
+        <w:t xml:space="preserve"> </w:t>
+      </w:r>
+      <w:proofErr w:type="spellStart"/>
+      <w:r>
+        <w:t>có</w:t>
+      </w:r>
+      <w:proofErr w:type="spellEnd"/>
+      <w:r>
+        <w:t xml:space="preserve"> </w:t>
+      </w:r>
+      <w:proofErr w:type="spellStart"/>
+      <w:r>
+        <w:t>quyền</w:t>
+      </w:r>
+      <w:proofErr w:type="spellEnd"/>
+      <w:r>
+        <w:t xml:space="preserve"> </w:t>
+      </w:r>
+      <w:proofErr w:type="spellStart"/>
+      <w:r>
+        <w:t>ghi</w:t>
+      </w:r>
+      <w:proofErr w:type="spellEnd"/>
+      <w:r>
+        <w:t xml:space="preserve"> </w:t>
+      </w:r>
+      <w:proofErr w:type="spellStart"/>
+      <w:r>
+        <w:t>vào</w:t>
+      </w:r>
+      <w:proofErr w:type="spellEnd"/>
+      <w:r>
+        <w:t xml:space="preserve"> repo </w:t>
+      </w:r>
+      <w:proofErr w:type="spellStart"/>
+      <w:r>
+        <w:t>thì</w:t>
+      </w:r>
+      <w:proofErr w:type="spellEnd"/>
+      <w:r>
+        <w:t xml:space="preserve"> </w:t>
+      </w:r>
+      <w:proofErr w:type="spellStart"/>
+      <w:r>
+        <w:t>mới</w:t>
+      </w:r>
+      <w:proofErr w:type="spellEnd"/>
+      <w:r>
+        <w:t xml:space="preserve"> push </w:t>
+      </w:r>
+      <w:proofErr w:type="spellStart"/>
+      <w:r>
+        <w:t>nhánh</w:t>
+      </w:r>
+      <w:proofErr w:type="spellEnd"/>
+      <w:r>
+        <w:t xml:space="preserve"> </w:t>
+      </w:r>
+      <w:proofErr w:type="spellStart"/>
+      <w:r>
+        <w:t>lên</w:t>
+      </w:r>
+      <w:proofErr w:type="spellEnd"/>
+      <w:r>
+        <w:t xml:space="preserve"> </w:t>
+      </w:r>
+      <w:proofErr w:type="spellStart"/>
+      <w:r>
+        <w:t>được</w:t>
+      </w:r>
+      <w:proofErr w:type="spellEnd"/>
+      <w:r>
+        <w:t>:</w:t>
+      </w:r>
+    </w:p>
+    <w:p>
+      <w:pPr>
+        <w:numPr>
+          <w:ilvl w:val="0"/>
+          <w:numId w:val="15"/>
+        </w:numPr>
+      </w:pPr>
+      <w:proofErr w:type="spellStart"/>
+      <w:r>
+        <w:t>Lên</w:t>
+      </w:r>
+      <w:proofErr w:type="spellEnd"/>
+      <w:r>
+        <w:t xml:space="preserve"> web GitHub, </w:t>
+      </w:r>
+      <w:proofErr w:type="spellStart"/>
+      <w:r>
+        <w:t>mở</w:t>
+      </w:r>
+      <w:proofErr w:type="spellEnd"/>
+      <w:r>
+        <w:t xml:space="preserve"> repo </w:t>
+      </w:r>
+      <w:proofErr w:type="spellStart"/>
+      <w:r>
+        <w:t>vừa</w:t>
+      </w:r>
+      <w:proofErr w:type="spellEnd"/>
+      <w:r>
+        <w:t xml:space="preserve"> </w:t>
+      </w:r>
+      <w:proofErr w:type="spellStart"/>
+      <w:r>
+        <w:t>tạo</w:t>
+      </w:r>
+      <w:proofErr w:type="spellEnd"/>
+      <w:r>
+        <w:t>.</w:t>
+      </w:r>
+    </w:p>
+    <w:p>
+      <w:pPr>
+        <w:numPr>
+          <w:ilvl w:val="0"/>
+          <w:numId w:val="15"/>
+        </w:numPr>
+      </w:pPr>
+      <w:proofErr w:type="spellStart"/>
+      <w:r>
+        <w:t>Bấm</w:t>
+      </w:r>
+      <w:proofErr w:type="spellEnd"/>
+      <w:r>
+        <w:t xml:space="preserve"> </w:t>
+      </w:r>
+      <w:proofErr w:type="spellStart"/>
+      <w:r>
+        <w:t>vào</w:t>
+      </w:r>
+      <w:proofErr w:type="spellEnd"/>
+      <w:r>
+        <w:t xml:space="preserve"> </w:t>
+      </w:r>
+      <w:r>
+        <w:rPr>
+          <w:b/>
+          <w:bCs/>
+        </w:rPr>
+        <w:t>Settings</w:t>
+      </w:r>
+      <w:r>
+        <w:t xml:space="preserve"> (tab bánh </w:t>
+      </w:r>
+      <w:proofErr w:type="spellStart"/>
+      <w:r>
+        <w:t>răng</w:t>
+      </w:r>
+      <w:proofErr w:type="spellEnd"/>
+      <w:r>
+        <w:t xml:space="preserve"> ở </w:t>
+      </w:r>
+      <w:proofErr w:type="spellStart"/>
+      <w:r>
+        <w:t>góc</w:t>
+      </w:r>
+      <w:proofErr w:type="spellEnd"/>
+      <w:r>
+        <w:t xml:space="preserve"> </w:t>
+      </w:r>
+      <w:proofErr w:type="spellStart"/>
+      <w:r>
+        <w:t>trên</w:t>
+      </w:r>
+      <w:proofErr w:type="spellEnd"/>
+      <w:r>
+        <w:t>).</w:t>
+      </w:r>
+    </w:p>
+    <w:p>
+      <w:pPr>
+        <w:numPr>
+          <w:ilvl w:val="0"/>
+          <w:numId w:val="15"/>
+        </w:numPr>
+      </w:pPr>
+      <w:r>
+        <w:t xml:space="preserve">Ở </w:t>
+      </w:r>
+      <w:proofErr w:type="spellStart"/>
+      <w:r>
+        <w:t>cột</w:t>
+      </w:r>
+      <w:proofErr w:type="spellEnd"/>
+      <w:r>
+        <w:t xml:space="preserve"> </w:t>
+      </w:r>
+      <w:proofErr w:type="spellStart"/>
+      <w:r>
+        <w:t>bên</w:t>
+      </w:r>
+      <w:proofErr w:type="spellEnd"/>
+      <w:r>
+        <w:t xml:space="preserve"> </w:t>
+      </w:r>
+      <w:proofErr w:type="spellStart"/>
+      <w:r>
+        <w:t>trái</w:t>
+      </w:r>
+      <w:proofErr w:type="spellEnd"/>
+      <w:r>
+        <w:t xml:space="preserve">, </w:t>
+      </w:r>
+      <w:proofErr w:type="spellStart"/>
+      <w:r>
+        <w:t>chọn</w:t>
+      </w:r>
+      <w:proofErr w:type="spellEnd"/>
+      <w:r>
+        <w:t xml:space="preserve"> </w:t>
+      </w:r>
+      <w:r>
+        <w:rPr>
+          <w:b/>
+          <w:bCs/>
+        </w:rPr>
+        <w:t>Collaborators</w:t>
+      </w:r>
+      <w:r>
+        <w:t xml:space="preserve"> &gt; </w:t>
+      </w:r>
+      <w:proofErr w:type="spellStart"/>
+      <w:r>
+        <w:t>Bấm</w:t>
+      </w:r>
+      <w:proofErr w:type="spellEnd"/>
+      <w:r>
+        <w:t xml:space="preserve"> </w:t>
+      </w:r>
+      <w:proofErr w:type="spellStart"/>
+      <w:r>
+        <w:t>nút</w:t>
+      </w:r>
+      <w:proofErr w:type="spellEnd"/>
+      <w:r>
+        <w:t xml:space="preserve"> </w:t>
+      </w:r>
+      <w:proofErr w:type="spellStart"/>
+      <w:r>
+        <w:t>xanh</w:t>
+      </w:r>
+      <w:proofErr w:type="spellEnd"/>
+      <w:r>
+        <w:t xml:space="preserve"> </w:t>
+      </w:r>
+      <w:r>
+        <w:rPr>
+          <w:b/>
+          <w:bCs/>
+        </w:rPr>
+        <w:t>Add people</w:t>
+      </w:r>
+      <w:r>
+        <w:t>.</w:t>
+      </w:r>
+    </w:p>
+    <w:p>
+      <w:pPr>
+        <w:numPr>
+          <w:ilvl w:val="0"/>
+          <w:numId w:val="15"/>
+        </w:numPr>
+      </w:pPr>
+      <w:r>
+        <w:t xml:space="preserve">Nhập username GitHub </w:t>
+      </w:r>
+      <w:proofErr w:type="spellStart"/>
+      <w:r>
+        <w:t>hoặc</w:t>
+      </w:r>
+      <w:proofErr w:type="spellEnd"/>
+      <w:r>
+        <w:t xml:space="preserve"> email </w:t>
+      </w:r>
+      <w:proofErr w:type="spellStart"/>
+      <w:r>
+        <w:t>của</w:t>
+      </w:r>
+      <w:proofErr w:type="spellEnd"/>
+      <w:r>
+        <w:t xml:space="preserve"> </w:t>
+      </w:r>
+      <w:proofErr w:type="spellStart"/>
+      <w:r>
+        <w:t>Bạn</w:t>
+      </w:r>
+      <w:proofErr w:type="spellEnd"/>
+      <w:r>
+        <w:t xml:space="preserve"> 2 </w:t>
+      </w:r>
+      <w:proofErr w:type="spellStart"/>
+      <w:r>
+        <w:t>và</w:t>
+      </w:r>
+      <w:proofErr w:type="spellEnd"/>
+      <w:r>
+        <w:t xml:space="preserve"> </w:t>
+      </w:r>
+      <w:proofErr w:type="spellStart"/>
+      <w:r>
+        <w:t>Bạn</w:t>
+      </w:r>
+      <w:proofErr w:type="spellEnd"/>
+      <w:r>
+        <w:t xml:space="preserve"> 3 </w:t>
+      </w:r>
+      <w:proofErr w:type="spellStart"/>
+      <w:r>
+        <w:t>để</w:t>
+      </w:r>
+      <w:proofErr w:type="spellEnd"/>
+      <w:r>
+        <w:t xml:space="preserve"> </w:t>
+      </w:r>
+      <w:proofErr w:type="spellStart"/>
+      <w:r>
+        <w:t>gửi</w:t>
+      </w:r>
+      <w:proofErr w:type="spellEnd"/>
+      <w:r>
+        <w:t xml:space="preserve"> </w:t>
+      </w:r>
+      <w:proofErr w:type="spellStart"/>
+      <w:r>
+        <w:t>lời</w:t>
+      </w:r>
+      <w:proofErr w:type="spellEnd"/>
+      <w:r>
+        <w:t xml:space="preserve"> </w:t>
+      </w:r>
+      <w:proofErr w:type="spellStart"/>
+      <w:r>
+        <w:t>mời</w:t>
+      </w:r>
+      <w:proofErr w:type="spellEnd"/>
+      <w:r>
+        <w:t>.</w:t>
+      </w:r>
+    </w:p>
+    <w:p>
+      <w:pPr>
+        <w:numPr>
+          <w:ilvl w:val="0"/>
+          <w:numId w:val="15"/>
+        </w:numPr>
+      </w:pPr>
+      <w:proofErr w:type="spellStart"/>
+      <w:r>
+        <w:rPr>
+          <w:b/>
+          <w:bCs/>
+        </w:rPr>
+        <w:t>Nhắc</w:t>
+      </w:r>
+      <w:proofErr w:type="spellEnd"/>
+      <w:r>
+        <w:rPr>
+          <w:b/>
+          <w:bCs/>
+        </w:rPr>
+        <w:t xml:space="preserve"> 2 </w:t>
+      </w:r>
+      <w:proofErr w:type="spellStart"/>
+      <w:r>
+        <w:rPr>
+          <w:b/>
+          <w:bCs/>
+        </w:rPr>
+        <w:t>bạn</w:t>
+      </w:r>
+      <w:proofErr w:type="spellEnd"/>
+      <w:r>
+        <w:rPr>
+          <w:b/>
+          <w:bCs/>
+        </w:rPr>
+        <w:t>:</w:t>
+      </w:r>
+      <w:r>
+        <w:t xml:space="preserve"> Check email </w:t>
+      </w:r>
+      <w:proofErr w:type="spellStart"/>
+      <w:r>
+        <w:t>hoặc</w:t>
+      </w:r>
+      <w:proofErr w:type="spellEnd"/>
+      <w:r>
+        <w:t xml:space="preserve"> </w:t>
+      </w:r>
+      <w:proofErr w:type="spellStart"/>
+      <w:r>
+        <w:t>vào</w:t>
+      </w:r>
+      <w:proofErr w:type="spellEnd"/>
+      <w:r>
+        <w:t xml:space="preserve"> </w:t>
+      </w:r>
+      <w:proofErr w:type="spellStart"/>
+      <w:r>
+        <w:t>thẳng</w:t>
+      </w:r>
+      <w:proofErr w:type="spellEnd"/>
+      <w:r>
+        <w:t xml:space="preserve"> link repo </w:t>
+      </w:r>
+      <w:proofErr w:type="spellStart"/>
+      <w:r>
+        <w:t>bấm</w:t>
+      </w:r>
+      <w:proofErr w:type="spellEnd"/>
+      <w:r>
+        <w:t xml:space="preserve"> </w:t>
+      </w:r>
+      <w:r>
+        <w:rPr>
+          <w:b/>
+          <w:bCs/>
+        </w:rPr>
+        <w:t>Accept invitation</w:t>
+      </w:r>
+      <w:r>
+        <w:t xml:space="preserve"> (</w:t>
+      </w:r>
+      <w:proofErr w:type="spellStart"/>
+      <w:r>
+        <w:t>nếu</w:t>
+      </w:r>
+      <w:proofErr w:type="spellEnd"/>
+      <w:r>
+        <w:t xml:space="preserve"> </w:t>
+      </w:r>
+      <w:proofErr w:type="spellStart"/>
+      <w:r>
+        <w:t>không</w:t>
+      </w:r>
+      <w:proofErr w:type="spellEnd"/>
+      <w:r>
+        <w:t xml:space="preserve"> </w:t>
+      </w:r>
+      <w:proofErr w:type="spellStart"/>
+      <w:r>
+        <w:t>chấp</w:t>
+      </w:r>
+      <w:proofErr w:type="spellEnd"/>
+      <w:r>
+        <w:t xml:space="preserve"> </w:t>
+      </w:r>
+      <w:proofErr w:type="spellStart"/>
+      <w:r>
+        <w:t>nhận</w:t>
+      </w:r>
+      <w:proofErr w:type="spellEnd"/>
+      <w:r>
+        <w:t xml:space="preserve"> </w:t>
+      </w:r>
+      <w:proofErr w:type="spellStart"/>
+      <w:r>
+        <w:t>thì</w:t>
+      </w:r>
+      <w:proofErr w:type="spellEnd"/>
+      <w:r>
+        <w:t xml:space="preserve"> 2 </w:t>
+      </w:r>
+      <w:proofErr w:type="spellStart"/>
+      <w:r>
+        <w:t>bạn</w:t>
+      </w:r>
+      <w:proofErr w:type="spellEnd"/>
+      <w:r>
+        <w:t xml:space="preserve"> </w:t>
+      </w:r>
+      <w:proofErr w:type="spellStart"/>
+      <w:r>
+        <w:t>đó</w:t>
+      </w:r>
+      <w:proofErr w:type="spellEnd"/>
+      <w:r>
+        <w:t xml:space="preserve"> </w:t>
+      </w:r>
+      <w:proofErr w:type="spellStart"/>
+      <w:r>
+        <w:t>không</w:t>
+      </w:r>
+      <w:proofErr w:type="spellEnd"/>
+      <w:r>
+        <w:t xml:space="preserve"> push code </w:t>
+      </w:r>
+      <w:proofErr w:type="spellStart"/>
+      <w:r>
+        <w:t>lên</w:t>
+      </w:r>
+      <w:proofErr w:type="spellEnd"/>
+      <w:r>
+        <w:t xml:space="preserve"> </w:t>
+      </w:r>
+      <w:proofErr w:type="spellStart"/>
+      <w:r>
+        <w:t>được</w:t>
+      </w:r>
+      <w:proofErr w:type="spellEnd"/>
+      <w:r>
+        <w:t>).</w:t>
+      </w:r>
+    </w:p>
+    <w:p>
+      <w:pPr>
+        <w:rPr>
+          <w:b/>
+          <w:bCs/>
+        </w:rPr>
+      </w:pPr>
+      <w:proofErr w:type="spellStart"/>
+      <w:r>
+        <w:rPr>
+          <w:b/>
+          <w:bCs/>
+        </w:rPr>
+        <w:t>Bước</w:t>
+      </w:r>
+      <w:proofErr w:type="spellEnd"/>
+      <w:r>
+        <w:rPr>
+          <w:b/>
+          <w:bCs/>
+        </w:rPr>
+        <w:t xml:space="preserve"> 2: </w:t>
+      </w:r>
+      <w:proofErr w:type="spellStart"/>
+      <w:r>
+        <w:rPr>
+          <w:b/>
+          <w:bCs/>
+        </w:rPr>
+        <w:t>Tạo</w:t>
+      </w:r>
+      <w:proofErr w:type="spellEnd"/>
+      <w:r>
+        <w:rPr>
+          <w:b/>
+          <w:bCs/>
+        </w:rPr>
+        <w:t xml:space="preserve"> </w:t>
+      </w:r>
+      <w:proofErr w:type="spellStart"/>
+      <w:r>
+        <w:rPr>
+          <w:b/>
+          <w:bCs/>
+        </w:rPr>
+        <w:t>nhánh</w:t>
+      </w:r>
+      <w:proofErr w:type="spellEnd"/>
+      <w:r>
+        <w:rPr>
+          <w:b/>
+          <w:bCs/>
+        </w:rPr>
+        <w:t xml:space="preserve"> </w:t>
+      </w:r>
+      <w:proofErr w:type="spellStart"/>
+      <w:r>
+        <w:rPr>
+          <w:b/>
+          <w:bCs/>
+        </w:rPr>
+        <w:t>riêng</w:t>
+      </w:r>
+      <w:proofErr w:type="spellEnd"/>
+      <w:r>
+        <w:rPr>
+          <w:b/>
+          <w:bCs/>
+        </w:rPr>
+        <w:t xml:space="preserve"> </w:t>
+      </w:r>
+      <w:proofErr w:type="spellStart"/>
+      <w:r>
+        <w:rPr>
+          <w:b/>
+          <w:bCs/>
+        </w:rPr>
+        <w:t>của</w:t>
+      </w:r>
+      <w:proofErr w:type="spellEnd"/>
+      <w:r>
+        <w:rPr>
+          <w:b/>
+          <w:bCs/>
+        </w:rPr>
+        <w:t xml:space="preserve"> </w:t>
+      </w:r>
+      <w:proofErr w:type="spellStart"/>
+      <w:r>
+        <w:rPr>
+          <w:b/>
+          <w:bCs/>
+        </w:rPr>
+        <w:t>bạn</w:t>
+      </w:r>
+      <w:proofErr w:type="spellEnd"/>
+      <w:r>
+        <w:rPr>
+          <w:b/>
+          <w:bCs/>
+        </w:rPr>
+        <w:t xml:space="preserve"> (</w:t>
+      </w:r>
+      <w:proofErr w:type="spellStart"/>
+      <w:r>
+        <w:rPr>
+          <w:b/>
+          <w:bCs/>
+        </w:rPr>
+        <w:t>Người</w:t>
+      </w:r>
+      <w:proofErr w:type="spellEnd"/>
+      <w:r>
+        <w:rPr>
+          <w:b/>
+          <w:bCs/>
+        </w:rPr>
+        <w:t xml:space="preserve"> 1) </w:t>
+      </w:r>
+      <w:proofErr w:type="spellStart"/>
+      <w:r>
+        <w:rPr>
+          <w:b/>
+          <w:bCs/>
+        </w:rPr>
+        <w:t>để</w:t>
+      </w:r>
+      <w:proofErr w:type="spellEnd"/>
+      <w:r>
+        <w:rPr>
+          <w:b/>
+          <w:bCs/>
+        </w:rPr>
+        <w:t xml:space="preserve"> </w:t>
+      </w:r>
+      <w:proofErr w:type="spellStart"/>
+      <w:r>
+        <w:rPr>
+          <w:b/>
+          <w:bCs/>
+        </w:rPr>
+        <w:t>bắt</w:t>
+      </w:r>
+      <w:proofErr w:type="spellEnd"/>
+      <w:r>
+        <w:rPr>
+          <w:b/>
+          <w:bCs/>
+        </w:rPr>
+        <w:t xml:space="preserve"> </w:t>
+      </w:r>
+      <w:proofErr w:type="spellStart"/>
+      <w:r>
+        <w:rPr>
+          <w:b/>
+          <w:bCs/>
+        </w:rPr>
+        <w:t>đầu</w:t>
+      </w:r>
+      <w:proofErr w:type="spellEnd"/>
+      <w:r>
+        <w:rPr>
+          <w:b/>
+          <w:bCs/>
+        </w:rPr>
+        <w:t xml:space="preserve"> code</w:t>
+      </w:r>
+    </w:p>
+    <w:p>
+      <w:proofErr w:type="spellStart"/>
+      <w:r>
+        <w:t>Nhánh</w:t>
+      </w:r>
+      <w:proofErr w:type="spellEnd"/>
+      <w:r>
+        <w:t xml:space="preserve"> main </w:t>
+      </w:r>
+      <w:proofErr w:type="spellStart"/>
+      <w:r>
+        <w:t>giờ</w:t>
+      </w:r>
+      <w:proofErr w:type="spellEnd"/>
+      <w:r>
+        <w:t xml:space="preserve"> </w:t>
+      </w:r>
+      <w:proofErr w:type="spellStart"/>
+      <w:r>
+        <w:t>là</w:t>
+      </w:r>
+      <w:proofErr w:type="spellEnd"/>
+      <w:r>
+        <w:t xml:space="preserve"> </w:t>
+      </w:r>
+      <w:proofErr w:type="spellStart"/>
+      <w:r>
+        <w:t>nhánh</w:t>
+      </w:r>
+      <w:proofErr w:type="spellEnd"/>
+      <w:r>
+        <w:t xml:space="preserve"> </w:t>
+      </w:r>
+      <w:proofErr w:type="spellStart"/>
+      <w:r>
+        <w:t>chuẩn</w:t>
+      </w:r>
+      <w:proofErr w:type="spellEnd"/>
+      <w:r>
+        <w:t xml:space="preserve">, </w:t>
+      </w:r>
+      <w:proofErr w:type="spellStart"/>
+      <w:r>
+        <w:rPr>
+          <w:b/>
+          <w:bCs/>
+        </w:rPr>
+        <w:t>bạn</w:t>
+      </w:r>
+      <w:proofErr w:type="spellEnd"/>
+      <w:r>
+        <w:rPr>
+          <w:b/>
+          <w:bCs/>
+        </w:rPr>
+        <w:t xml:space="preserve"> </w:t>
+      </w:r>
+      <w:proofErr w:type="spellStart"/>
+      <w:r>
+        <w:rPr>
+          <w:b/>
+          <w:bCs/>
+        </w:rPr>
+        <w:t>không</w:t>
+      </w:r>
+      <w:proofErr w:type="spellEnd"/>
+      <w:r>
+        <w:rPr>
+          <w:b/>
+          <w:bCs/>
+        </w:rPr>
+        <w:t xml:space="preserve"> </w:t>
+      </w:r>
+      <w:proofErr w:type="spellStart"/>
+      <w:r>
+        <w:rPr>
+          <w:b/>
+          <w:bCs/>
+        </w:rPr>
+        <w:t>được</w:t>
+      </w:r>
+      <w:proofErr w:type="spellEnd"/>
+      <w:r>
+        <w:rPr>
+          <w:b/>
+          <w:bCs/>
+        </w:rPr>
+        <w:t xml:space="preserve"> code </w:t>
+      </w:r>
+      <w:proofErr w:type="spellStart"/>
+      <w:r>
+        <w:rPr>
+          <w:b/>
+          <w:bCs/>
+        </w:rPr>
+        <w:t>thẳng</w:t>
+      </w:r>
+      <w:proofErr w:type="spellEnd"/>
+      <w:r>
+        <w:rPr>
+          <w:b/>
+          <w:bCs/>
+        </w:rPr>
+        <w:t xml:space="preserve"> </w:t>
+      </w:r>
+      <w:proofErr w:type="spellStart"/>
+      <w:r>
+        <w:rPr>
+          <w:b/>
+          <w:bCs/>
+        </w:rPr>
+        <w:t>trên</w:t>
+      </w:r>
+      <w:proofErr w:type="spellEnd"/>
+      <w:r>
+        <w:rPr>
+          <w:b/>
+          <w:bCs/>
+        </w:rPr>
+        <w:t xml:space="preserve"> main </w:t>
+      </w:r>
+      <w:proofErr w:type="spellStart"/>
+      <w:r>
+        <w:rPr>
+          <w:b/>
+          <w:bCs/>
+        </w:rPr>
+        <w:t>nữa</w:t>
+      </w:r>
+      <w:proofErr w:type="spellEnd"/>
+      <w:r>
+        <w:t xml:space="preserve">. </w:t>
+      </w:r>
+      <w:proofErr w:type="spellStart"/>
+      <w:r>
+        <w:t>Bạn</w:t>
+      </w:r>
+      <w:proofErr w:type="spellEnd"/>
+      <w:r>
+        <w:t xml:space="preserve"> </w:t>
+      </w:r>
+      <w:proofErr w:type="spellStart"/>
+      <w:r>
+        <w:t>mở</w:t>
+      </w:r>
+      <w:proofErr w:type="spellEnd"/>
+      <w:r>
+        <w:t xml:space="preserve"> Terminal ở </w:t>
+      </w:r>
+      <w:proofErr w:type="spellStart"/>
+      <w:r>
+        <w:t>máy</w:t>
+      </w:r>
+      <w:proofErr w:type="spellEnd"/>
+      <w:r>
+        <w:t xml:space="preserve"> </w:t>
+      </w:r>
+      <w:proofErr w:type="spellStart"/>
+      <w:r>
+        <w:t>bạn</w:t>
+      </w:r>
+      <w:proofErr w:type="spellEnd"/>
+      <w:r>
+        <w:t xml:space="preserve"> </w:t>
+      </w:r>
+      <w:proofErr w:type="spellStart"/>
+      <w:r>
+        <w:t>và</w:t>
+      </w:r>
+      <w:proofErr w:type="spellEnd"/>
+      <w:r>
+        <w:t xml:space="preserve"> </w:t>
+      </w:r>
+      <w:proofErr w:type="spellStart"/>
+      <w:r>
+        <w:t>tạo</w:t>
+      </w:r>
+      <w:proofErr w:type="spellEnd"/>
+      <w:r>
+        <w:t xml:space="preserve"> </w:t>
+      </w:r>
+      <w:proofErr w:type="spellStart"/>
+      <w:r>
+        <w:t>nhánh</w:t>
+      </w:r>
+      <w:proofErr w:type="spellEnd"/>
+      <w:r>
+        <w:t xml:space="preserve"> </w:t>
+      </w:r>
+      <w:proofErr w:type="spellStart"/>
+      <w:r>
+        <w:t>riêng</w:t>
+      </w:r>
+      <w:proofErr w:type="spellEnd"/>
+      <w:r>
+        <w:t>:</w:t>
+      </w:r>
+    </w:p>
+    <w:p>
+      <w:r>
+        <w:t>Bash</w:t>
+      </w:r>
+    </w:p>
+    <w:p>
+      <w:r>
+        <w:t xml:space="preserve"># </w:t>
+      </w:r>
+      <w:proofErr w:type="spellStart"/>
+      <w:r>
+        <w:t>Tạo</w:t>
+      </w:r>
+      <w:proofErr w:type="spellEnd"/>
+      <w:r>
+        <w:t xml:space="preserve"> </w:t>
+      </w:r>
+      <w:proofErr w:type="spellStart"/>
+      <w:r>
+        <w:t>và</w:t>
+      </w:r>
+      <w:proofErr w:type="spellEnd"/>
+      <w:r>
+        <w:t xml:space="preserve"> </w:t>
+      </w:r>
+      <w:proofErr w:type="spellStart"/>
+      <w:r>
+        <w:t>chuyển</w:t>
+      </w:r>
+      <w:proofErr w:type="spellEnd"/>
+      <w:r>
+        <w:t xml:space="preserve"> sang </w:t>
+      </w:r>
+      <w:proofErr w:type="spellStart"/>
+      <w:r>
+        <w:t>nhánh</w:t>
+      </w:r>
+      <w:proofErr w:type="spellEnd"/>
+      <w:r>
+        <w:t xml:space="preserve"> </w:t>
+      </w:r>
+      <w:proofErr w:type="spellStart"/>
+      <w:r>
+        <w:t>làm</w:t>
+      </w:r>
+      <w:proofErr w:type="spellEnd"/>
+      <w:r>
+        <w:t xml:space="preserve"> </w:t>
+      </w:r>
+      <w:proofErr w:type="spellStart"/>
+      <w:r>
+        <w:t>việc</w:t>
+      </w:r>
+      <w:proofErr w:type="spellEnd"/>
+      <w:r>
+        <w:t xml:space="preserve"> </w:t>
+      </w:r>
+      <w:proofErr w:type="spellStart"/>
+      <w:r>
+        <w:t>của</w:t>
+      </w:r>
+      <w:proofErr w:type="spellEnd"/>
+      <w:r>
+        <w:t xml:space="preserve"> </w:t>
+      </w:r>
+      <w:proofErr w:type="spellStart"/>
+      <w:r>
+        <w:t>Người</w:t>
+      </w:r>
+      <w:proofErr w:type="spellEnd"/>
+      <w:r>
+        <w:t xml:space="preserve"> 1</w:t>
+      </w:r>
+    </w:p>
+    <w:p>
+      <w:r>
+        <w:t>git checkout -b feature/core-auth-transfer</w:t>
+      </w:r>
+    </w:p>
+    <w:p>
+      <w:proofErr w:type="spellStart"/>
+      <w:r>
+        <w:t>Từ</w:t>
+      </w:r>
+      <w:proofErr w:type="spellEnd"/>
+      <w:r>
+        <w:t xml:space="preserve"> </w:t>
+      </w:r>
+      <w:proofErr w:type="spellStart"/>
+      <w:r>
+        <w:t>giờ</w:t>
+      </w:r>
+      <w:proofErr w:type="spellEnd"/>
+      <w:r>
+        <w:t xml:space="preserve">, </w:t>
+      </w:r>
+      <w:proofErr w:type="spellStart"/>
+      <w:r>
+        <w:t>bạn</w:t>
+      </w:r>
+      <w:proofErr w:type="spellEnd"/>
+      <w:r>
+        <w:t xml:space="preserve"> </w:t>
+      </w:r>
+      <w:proofErr w:type="spellStart"/>
+      <w:r>
+        <w:t>chỉ</w:t>
+      </w:r>
+      <w:proofErr w:type="spellEnd"/>
+      <w:r>
+        <w:t xml:space="preserve"> </w:t>
+      </w:r>
+      <w:proofErr w:type="spellStart"/>
+      <w:r>
+        <w:t>việc</w:t>
+      </w:r>
+      <w:proofErr w:type="spellEnd"/>
+      <w:r>
+        <w:t xml:space="preserve"> code </w:t>
+      </w:r>
+      <w:proofErr w:type="spellStart"/>
+      <w:r>
+        <w:t>các</w:t>
+      </w:r>
+      <w:proofErr w:type="spellEnd"/>
+      <w:r>
+        <w:t xml:space="preserve"> </w:t>
+      </w:r>
+      <w:proofErr w:type="spellStart"/>
+      <w:r>
+        <w:t>phần</w:t>
+      </w:r>
+      <w:proofErr w:type="spellEnd"/>
+      <w:r>
+        <w:t xml:space="preserve"> </w:t>
+      </w:r>
+      <w:proofErr w:type="spellStart"/>
+      <w:r>
+        <w:t>của</w:t>
+      </w:r>
+      <w:proofErr w:type="spellEnd"/>
+      <w:r>
+        <w:t xml:space="preserve"> </w:t>
+      </w:r>
+      <w:proofErr w:type="spellStart"/>
+      <w:r>
+        <w:t>bạn</w:t>
+      </w:r>
+      <w:proofErr w:type="spellEnd"/>
+      <w:r>
+        <w:t xml:space="preserve"> (</w:t>
+      </w:r>
+      <w:proofErr w:type="spellStart"/>
+      <w:r>
+        <w:t>LoginForm</w:t>
+      </w:r>
+      <w:proofErr w:type="spellEnd"/>
+      <w:r>
+        <w:t xml:space="preserve">, </w:t>
+      </w:r>
+      <w:proofErr w:type="spellStart"/>
+      <w:r>
+        <w:t>TransferForm</w:t>
+      </w:r>
+      <w:proofErr w:type="spellEnd"/>
+      <w:r>
+        <w:t xml:space="preserve">, RMI Registry, Callback, ...). </w:t>
+      </w:r>
+      <w:proofErr w:type="spellStart"/>
+      <w:r>
+        <w:t>Hàng</w:t>
+      </w:r>
+      <w:proofErr w:type="spellEnd"/>
+      <w:r>
+        <w:t xml:space="preserve"> </w:t>
+      </w:r>
+      <w:proofErr w:type="spellStart"/>
+      <w:r>
+        <w:t>ngày</w:t>
+      </w:r>
+      <w:proofErr w:type="spellEnd"/>
+      <w:r>
+        <w:t xml:space="preserve"> code </w:t>
+      </w:r>
+      <w:proofErr w:type="spellStart"/>
+      <w:r>
+        <w:t>xong</w:t>
+      </w:r>
+      <w:proofErr w:type="spellEnd"/>
+      <w:r>
+        <w:t xml:space="preserve"> </w:t>
+      </w:r>
+      <w:proofErr w:type="spellStart"/>
+      <w:r>
+        <w:t>thì</w:t>
+      </w:r>
+      <w:proofErr w:type="spellEnd"/>
+      <w:r>
+        <w:t xml:space="preserve"> </w:t>
+      </w:r>
+      <w:proofErr w:type="spellStart"/>
+      <w:r>
+        <w:t>cứ</w:t>
+      </w:r>
+      <w:proofErr w:type="spellEnd"/>
+      <w:r>
+        <w:t xml:space="preserve"> commit </w:t>
+      </w:r>
+      <w:proofErr w:type="spellStart"/>
+      <w:r>
+        <w:t>và</w:t>
+      </w:r>
+      <w:proofErr w:type="spellEnd"/>
+      <w:r>
+        <w:t xml:space="preserve"> push </w:t>
+      </w:r>
+      <w:proofErr w:type="spellStart"/>
+      <w:r>
+        <w:t>lên</w:t>
+      </w:r>
+      <w:proofErr w:type="spellEnd"/>
+      <w:r>
+        <w:t xml:space="preserve"> </w:t>
+      </w:r>
+      <w:proofErr w:type="spellStart"/>
+      <w:r>
+        <w:t>nhánh</w:t>
+      </w:r>
+      <w:proofErr w:type="spellEnd"/>
+      <w:r>
+        <w:t xml:space="preserve"> </w:t>
+      </w:r>
+      <w:proofErr w:type="spellStart"/>
+      <w:r>
+        <w:t>này</w:t>
+      </w:r>
+      <w:proofErr w:type="spellEnd"/>
+      <w:r>
+        <w:t>:</w:t>
+      </w:r>
+    </w:p>
+    <w:p>
+      <w:r>
+        <w:t>Bash</w:t>
+      </w:r>
+    </w:p>
+    <w:p>
+      <w:r>
+        <w:t xml:space="preserve">git </w:t>
+      </w:r>
+      <w:proofErr w:type="gramStart"/>
+      <w:r>
+        <w:t>add .</w:t>
+      </w:r>
+      <w:proofErr w:type="gramEnd"/>
+    </w:p>
+    <w:p>
+      <w:r>
+        <w:t xml:space="preserve">git commit -m "feat: setup RMI Registry </w:t>
+      </w:r>
+      <w:proofErr w:type="spellStart"/>
+      <w:r>
+        <w:t>va</w:t>
+      </w:r>
+      <w:proofErr w:type="spellEnd"/>
+      <w:r>
+        <w:t xml:space="preserve"> xu </w:t>
+      </w:r>
+      <w:proofErr w:type="spellStart"/>
+      <w:r>
+        <w:t>ly</w:t>
+      </w:r>
+      <w:proofErr w:type="spellEnd"/>
+      <w:r>
+        <w:t xml:space="preserve"> dang </w:t>
+      </w:r>
+      <w:proofErr w:type="spellStart"/>
+      <w:r>
+        <w:t>nhap</w:t>
+      </w:r>
+      <w:proofErr w:type="spellEnd"/>
+      <w:r>
+        <w:t>"</w:t>
+      </w:r>
+    </w:p>
+    <w:p>
+      <w:r>
+        <w:t>git push origin feature/core-auth-transfer</w:t>
+      </w:r>
+    </w:p>
+    <w:p>
+      <w:pPr>
+        <w:rPr>
+          <w:b/>
+          <w:bCs/>
+        </w:rPr>
+      </w:pPr>
+      <w:proofErr w:type="spellStart"/>
+      <w:r>
+        <w:rPr>
+          <w:b/>
+          <w:bCs/>
+        </w:rPr>
+        <w:t>Bước</w:t>
+      </w:r>
+      <w:proofErr w:type="spellEnd"/>
+      <w:r>
+        <w:rPr>
+          <w:b/>
+          <w:bCs/>
+        </w:rPr>
+        <w:t xml:space="preserve"> 3: </w:t>
+      </w:r>
+      <w:proofErr w:type="spellStart"/>
+      <w:r>
+        <w:rPr>
+          <w:b/>
+          <w:bCs/>
+        </w:rPr>
+        <w:t>Gửi</w:t>
+      </w:r>
+      <w:proofErr w:type="spellEnd"/>
+      <w:r>
+        <w:rPr>
+          <w:b/>
+          <w:bCs/>
+        </w:rPr>
+        <w:t xml:space="preserve"> tin </w:t>
+      </w:r>
+      <w:proofErr w:type="spellStart"/>
+      <w:r>
+        <w:rPr>
+          <w:b/>
+          <w:bCs/>
+        </w:rPr>
+        <w:t>nhắn</w:t>
+      </w:r>
+      <w:proofErr w:type="spellEnd"/>
+      <w:r>
+        <w:rPr>
+          <w:b/>
+          <w:bCs/>
+        </w:rPr>
+        <w:t xml:space="preserve"> </w:t>
+      </w:r>
+      <w:proofErr w:type="spellStart"/>
+      <w:r>
+        <w:rPr>
+          <w:b/>
+          <w:bCs/>
+        </w:rPr>
+        <w:t>hướng</w:t>
+      </w:r>
+      <w:proofErr w:type="spellEnd"/>
+      <w:r>
+        <w:rPr>
+          <w:b/>
+          <w:bCs/>
+        </w:rPr>
+        <w:t xml:space="preserve"> </w:t>
+      </w:r>
+      <w:proofErr w:type="spellStart"/>
+      <w:r>
+        <w:rPr>
+          <w:b/>
+          <w:bCs/>
+        </w:rPr>
+        <w:t>dẫn</w:t>
+      </w:r>
+      <w:proofErr w:type="spellEnd"/>
+      <w:r>
+        <w:rPr>
+          <w:b/>
+          <w:bCs/>
+        </w:rPr>
+        <w:t xml:space="preserve"> </w:t>
+      </w:r>
+      <w:proofErr w:type="spellStart"/>
+      <w:r>
+        <w:rPr>
+          <w:b/>
+          <w:bCs/>
+        </w:rPr>
+        <w:t>cho</w:t>
+      </w:r>
+      <w:proofErr w:type="spellEnd"/>
+      <w:r>
+        <w:rPr>
+          <w:b/>
+          <w:bCs/>
+        </w:rPr>
+        <w:t xml:space="preserve"> </w:t>
+      </w:r>
+      <w:proofErr w:type="spellStart"/>
+      <w:r>
+        <w:rPr>
+          <w:b/>
+          <w:bCs/>
+        </w:rPr>
+        <w:t>Bạn</w:t>
+      </w:r>
+      <w:proofErr w:type="spellEnd"/>
+      <w:r>
+        <w:rPr>
+          <w:b/>
+          <w:bCs/>
+        </w:rPr>
+        <w:t xml:space="preserve"> 2 </w:t>
+      </w:r>
+      <w:proofErr w:type="spellStart"/>
+      <w:r>
+        <w:rPr>
+          <w:b/>
+          <w:bCs/>
+        </w:rPr>
+        <w:t>và</w:t>
+      </w:r>
+      <w:proofErr w:type="spellEnd"/>
+      <w:r>
+        <w:rPr>
+          <w:b/>
+          <w:bCs/>
+        </w:rPr>
+        <w:t xml:space="preserve"> </w:t>
+      </w:r>
+      <w:proofErr w:type="spellStart"/>
+      <w:r>
+        <w:rPr>
+          <w:b/>
+          <w:bCs/>
+        </w:rPr>
+        <w:t>Bạn</w:t>
+      </w:r>
+      <w:proofErr w:type="spellEnd"/>
+      <w:r>
+        <w:rPr>
+          <w:b/>
+          <w:bCs/>
+        </w:rPr>
+        <w:t xml:space="preserve"> 3</w:t>
+      </w:r>
+    </w:p>
+    <w:p>
+      <w:proofErr w:type="spellStart"/>
+      <w:r>
+        <w:t>Bạn</w:t>
+      </w:r>
+      <w:proofErr w:type="spellEnd"/>
+      <w:r>
+        <w:t xml:space="preserve"> copy </w:t>
+      </w:r>
+      <w:proofErr w:type="spellStart"/>
+      <w:r>
+        <w:t>toàn</w:t>
+      </w:r>
+      <w:proofErr w:type="spellEnd"/>
+      <w:r>
+        <w:t xml:space="preserve"> </w:t>
+      </w:r>
+      <w:proofErr w:type="spellStart"/>
+      <w:r>
+        <w:t>bộ</w:t>
+      </w:r>
+      <w:proofErr w:type="spellEnd"/>
+      <w:r>
+        <w:t xml:space="preserve"> </w:t>
+      </w:r>
+      <w:proofErr w:type="spellStart"/>
+      <w:r>
+        <w:t>đoạn</w:t>
+      </w:r>
+      <w:proofErr w:type="spellEnd"/>
+      <w:r>
+        <w:t xml:space="preserve"> tin </w:t>
+      </w:r>
+      <w:proofErr w:type="spellStart"/>
+      <w:r>
+        <w:t>nhắn</w:t>
+      </w:r>
+      <w:proofErr w:type="spellEnd"/>
+      <w:r>
+        <w:t xml:space="preserve"> </w:t>
+      </w:r>
+      <w:proofErr w:type="spellStart"/>
+      <w:r>
+        <w:t>dưới</w:t>
+      </w:r>
+      <w:proofErr w:type="spellEnd"/>
+      <w:r>
+        <w:t xml:space="preserve"> </w:t>
+      </w:r>
+      <w:proofErr w:type="spellStart"/>
+      <w:r>
+        <w:t>đây</w:t>
+      </w:r>
+      <w:proofErr w:type="spellEnd"/>
+      <w:r>
+        <w:t xml:space="preserve"> </w:t>
+      </w:r>
+      <w:proofErr w:type="spellStart"/>
+      <w:r>
+        <w:t>gửi</w:t>
+      </w:r>
+      <w:proofErr w:type="spellEnd"/>
+      <w:r>
+        <w:t xml:space="preserve"> </w:t>
+      </w:r>
+      <w:proofErr w:type="spellStart"/>
+      <w:r>
+        <w:t>vào</w:t>
+      </w:r>
+      <w:proofErr w:type="spellEnd"/>
+      <w:r>
+        <w:t xml:space="preserve"> </w:t>
+      </w:r>
+      <w:proofErr w:type="spellStart"/>
+      <w:r>
+        <w:t>nhóm</w:t>
+      </w:r>
+      <w:proofErr w:type="spellEnd"/>
+      <w:r>
+        <w:t xml:space="preserve"> chat </w:t>
+      </w:r>
+      <w:proofErr w:type="spellStart"/>
+      <w:r>
+        <w:t>Zalo</w:t>
+      </w:r>
+      <w:proofErr w:type="spellEnd"/>
+      <w:r>
+        <w:t xml:space="preserve">/Messenger </w:t>
+      </w:r>
+      <w:proofErr w:type="spellStart"/>
+      <w:r>
+        <w:t>của</w:t>
+      </w:r>
+      <w:proofErr w:type="spellEnd"/>
+      <w:r>
+        <w:t xml:space="preserve"> </w:t>
+      </w:r>
+      <w:proofErr w:type="spellStart"/>
+      <w:r>
+        <w:t>nhóm</w:t>
+      </w:r>
+      <w:proofErr w:type="spellEnd"/>
+      <w:r>
+        <w:t xml:space="preserve"> </w:t>
+      </w:r>
+      <w:proofErr w:type="spellStart"/>
+      <w:r>
+        <w:t>để</w:t>
+      </w:r>
+      <w:proofErr w:type="spellEnd"/>
+      <w:r>
+        <w:t xml:space="preserve"> 2 </w:t>
+      </w:r>
+      <w:proofErr w:type="spellStart"/>
+      <w:r>
+        <w:t>bạn</w:t>
+      </w:r>
+      <w:proofErr w:type="spellEnd"/>
+      <w:r>
+        <w:t xml:space="preserve"> </w:t>
+      </w:r>
+      <w:proofErr w:type="spellStart"/>
+      <w:r>
+        <w:t>bắt</w:t>
+      </w:r>
+      <w:proofErr w:type="spellEnd"/>
+      <w:r>
+        <w:t xml:space="preserve"> </w:t>
+      </w:r>
+      <w:proofErr w:type="spellStart"/>
+      <w:r>
+        <w:t>đầu</w:t>
+      </w:r>
+      <w:proofErr w:type="spellEnd"/>
+      <w:r>
+        <w:t>:</w:t>
+      </w:r>
+    </w:p>
+    <w:p>
+      <w:r>
+        <w:rPr>
+          <w:b/>
+          <w:bCs/>
+        </w:rPr>
+        <w:t>HƯỚNG DẪN BẮT ĐẦU DỰ ÁN EBANKING:</w:t>
+      </w:r>
+    </w:p>
+    <w:p>
+      <w:pPr>
+        <w:numPr>
+          <w:ilvl w:val="0"/>
+          <w:numId w:val="16"/>
+        </w:numPr>
+      </w:pPr>
+      <w:proofErr w:type="spellStart"/>
+      <w:r>
+        <w:t>Mọi</w:t>
+      </w:r>
+      <w:proofErr w:type="spellEnd"/>
+      <w:r>
+        <w:t xml:space="preserve"> </w:t>
+      </w:r>
+      <w:proofErr w:type="spellStart"/>
+      <w:r>
+        <w:t>người</w:t>
+      </w:r>
+      <w:proofErr w:type="spellEnd"/>
+      <w:r>
+        <w:t xml:space="preserve"> check email </w:t>
+      </w:r>
+      <w:proofErr w:type="spellStart"/>
+      <w:r>
+        <w:t>chấp</w:t>
+      </w:r>
+      <w:proofErr w:type="spellEnd"/>
+      <w:r>
+        <w:t xml:space="preserve"> </w:t>
+      </w:r>
+      <w:proofErr w:type="spellStart"/>
+      <w:r>
+        <w:t>nhận</w:t>
+      </w:r>
+      <w:proofErr w:type="spellEnd"/>
+      <w:r>
+        <w:t xml:space="preserve"> </w:t>
+      </w:r>
+      <w:proofErr w:type="spellStart"/>
+      <w:r>
+        <w:t>lời</w:t>
+      </w:r>
+      <w:proofErr w:type="spellEnd"/>
+      <w:r>
+        <w:t xml:space="preserve"> </w:t>
+      </w:r>
+      <w:proofErr w:type="spellStart"/>
+      <w:r>
+        <w:t>mời</w:t>
+      </w:r>
+      <w:proofErr w:type="spellEnd"/>
+      <w:r>
+        <w:t xml:space="preserve"> </w:t>
+      </w:r>
+      <w:proofErr w:type="spellStart"/>
+      <w:r>
+        <w:t>vào</w:t>
+      </w:r>
+      <w:proofErr w:type="spellEnd"/>
+      <w:r>
+        <w:t xml:space="preserve"> repo GitHub </w:t>
+      </w:r>
+      <w:proofErr w:type="spellStart"/>
+      <w:r>
+        <w:t>này</w:t>
+      </w:r>
+      <w:proofErr w:type="spellEnd"/>
+      <w:r>
+        <w:t xml:space="preserve"> </w:t>
+      </w:r>
+      <w:proofErr w:type="spellStart"/>
+      <w:r>
+        <w:t>trước</w:t>
+      </w:r>
+      <w:proofErr w:type="spellEnd"/>
+      <w:r>
+        <w:t>: &lt;DÁN BẠN CỦA LINK REPO VÀO ĐÂY&gt;.</w:t>
+      </w:r>
+    </w:p>
+    <w:p>
+      <w:pPr>
+        <w:numPr>
+          <w:ilvl w:val="0"/>
+          <w:numId w:val="16"/>
+        </w:numPr>
+      </w:pPr>
+      <w:proofErr w:type="spellStart"/>
+      <w:r>
+        <w:t>Mở</w:t>
+      </w:r>
+      <w:proofErr w:type="spellEnd"/>
+      <w:r>
+        <w:t xml:space="preserve"> Terminal </w:t>
+      </w:r>
+      <w:proofErr w:type="spellStart"/>
+      <w:r>
+        <w:t>trên</w:t>
+      </w:r>
+      <w:proofErr w:type="spellEnd"/>
+      <w:r>
+        <w:t xml:space="preserve"> </w:t>
+      </w:r>
+      <w:proofErr w:type="spellStart"/>
+      <w:r>
+        <w:t>máy</w:t>
+      </w:r>
+      <w:proofErr w:type="spellEnd"/>
+      <w:r>
+        <w:t xml:space="preserve"> </w:t>
+      </w:r>
+      <w:proofErr w:type="spellStart"/>
+      <w:r>
+        <w:t>các</w:t>
+      </w:r>
+      <w:proofErr w:type="spellEnd"/>
+      <w:r>
+        <w:t xml:space="preserve"> </w:t>
+      </w:r>
+      <w:proofErr w:type="spellStart"/>
+      <w:r>
+        <w:t>bạn</w:t>
+      </w:r>
+      <w:proofErr w:type="spellEnd"/>
+      <w:r>
+        <w:t xml:space="preserve">, </w:t>
+      </w:r>
+      <w:proofErr w:type="spellStart"/>
+      <w:r>
+        <w:t>chạy</w:t>
+      </w:r>
+      <w:proofErr w:type="spellEnd"/>
+      <w:r>
+        <w:t xml:space="preserve"> </w:t>
+      </w:r>
+      <w:proofErr w:type="spellStart"/>
+      <w:r>
+        <w:t>các</w:t>
+      </w:r>
+      <w:proofErr w:type="spellEnd"/>
+      <w:r>
+        <w:t xml:space="preserve"> </w:t>
+      </w:r>
+      <w:proofErr w:type="spellStart"/>
+      <w:r>
+        <w:t>lệnh</w:t>
+      </w:r>
+      <w:proofErr w:type="spellEnd"/>
+      <w:r>
+        <w:t xml:space="preserve"> </w:t>
+      </w:r>
+      <w:proofErr w:type="spellStart"/>
+      <w:r>
+        <w:t>sau</w:t>
+      </w:r>
+      <w:proofErr w:type="spellEnd"/>
+      <w:r>
+        <w:t xml:space="preserve"> </w:t>
+      </w:r>
+      <w:proofErr w:type="spellStart"/>
+      <w:r>
+        <w:t>để</w:t>
+      </w:r>
+      <w:proofErr w:type="spellEnd"/>
+      <w:r>
+        <w:t xml:space="preserve"> </w:t>
+      </w:r>
+      <w:proofErr w:type="spellStart"/>
+      <w:r>
+        <w:t>lấy</w:t>
+      </w:r>
+      <w:proofErr w:type="spellEnd"/>
+      <w:r>
+        <w:t xml:space="preserve"> code </w:t>
+      </w:r>
+      <w:proofErr w:type="spellStart"/>
+      <w:r>
+        <w:t>về</w:t>
+      </w:r>
+      <w:proofErr w:type="spellEnd"/>
+      <w:r>
+        <w:t>:</w:t>
+      </w:r>
+    </w:p>
+    <w:p>
+      <w:r>
+        <w:lastRenderedPageBreak/>
+        <w:t>Bash</w:t>
+      </w:r>
+    </w:p>
+    <w:p>
+      <w:r>
+        <w:t>git clone &lt;DÁN LINK REPO CỦA BẠN VÀO ĐÂY&gt;</w:t>
+      </w:r>
+    </w:p>
+    <w:p>
+      <w:r>
+        <w:t>cd &lt;TEN_THU_MUC_DU_AN&gt;</w:t>
+      </w:r>
+    </w:p>
+    <w:p>
+      <w:pPr>
+        <w:numPr>
+          <w:ilvl w:val="0"/>
+          <w:numId w:val="17"/>
+        </w:numPr>
+      </w:pPr>
+      <w:proofErr w:type="spellStart"/>
+      <w:r>
+        <w:t>Tạo</w:t>
+      </w:r>
+      <w:proofErr w:type="spellEnd"/>
+      <w:r>
+        <w:t xml:space="preserve"> </w:t>
+      </w:r>
+      <w:proofErr w:type="spellStart"/>
+      <w:r>
+        <w:t>nhánh</w:t>
+      </w:r>
+      <w:proofErr w:type="spellEnd"/>
+      <w:r>
+        <w:t xml:space="preserve"> </w:t>
+      </w:r>
+      <w:proofErr w:type="spellStart"/>
+      <w:r>
+        <w:t>riêng</w:t>
+      </w:r>
+      <w:proofErr w:type="spellEnd"/>
+      <w:r>
+        <w:t xml:space="preserve"> </w:t>
+      </w:r>
+      <w:proofErr w:type="spellStart"/>
+      <w:r>
+        <w:t>của</w:t>
+      </w:r>
+      <w:proofErr w:type="spellEnd"/>
+      <w:r>
+        <w:t xml:space="preserve"> </w:t>
+      </w:r>
+      <w:proofErr w:type="spellStart"/>
+      <w:r>
+        <w:t>từng</w:t>
+      </w:r>
+      <w:proofErr w:type="spellEnd"/>
+      <w:r>
+        <w:t xml:space="preserve"> </w:t>
+      </w:r>
+      <w:proofErr w:type="spellStart"/>
+      <w:r>
+        <w:t>người</w:t>
+      </w:r>
+      <w:proofErr w:type="spellEnd"/>
+      <w:r>
+        <w:t xml:space="preserve"> (ai </w:t>
+      </w:r>
+      <w:proofErr w:type="spellStart"/>
+      <w:r>
+        <w:t>làm</w:t>
+      </w:r>
+      <w:proofErr w:type="spellEnd"/>
+      <w:r>
+        <w:t xml:space="preserve"> </w:t>
+      </w:r>
+      <w:proofErr w:type="spellStart"/>
+      <w:r>
+        <w:t>phần</w:t>
+      </w:r>
+      <w:proofErr w:type="spellEnd"/>
+      <w:r>
+        <w:t xml:space="preserve"> </w:t>
+      </w:r>
+      <w:proofErr w:type="spellStart"/>
+      <w:r>
+        <w:t>nào</w:t>
+      </w:r>
+      <w:proofErr w:type="spellEnd"/>
+      <w:r>
+        <w:t xml:space="preserve"> </w:t>
+      </w:r>
+      <w:proofErr w:type="spellStart"/>
+      <w:r>
+        <w:t>thì</w:t>
+      </w:r>
+      <w:proofErr w:type="spellEnd"/>
+      <w:r>
+        <w:t xml:space="preserve"> </w:t>
+      </w:r>
+      <w:proofErr w:type="spellStart"/>
+      <w:r>
+        <w:t>chạy</w:t>
+      </w:r>
+      <w:proofErr w:type="spellEnd"/>
+      <w:r>
+        <w:t xml:space="preserve"> </w:t>
+      </w:r>
+      <w:proofErr w:type="spellStart"/>
+      <w:r>
+        <w:t>đúng</w:t>
+      </w:r>
+      <w:proofErr w:type="spellEnd"/>
+      <w:r>
+        <w:t xml:space="preserve"> </w:t>
+      </w:r>
+      <w:proofErr w:type="spellStart"/>
+      <w:r>
+        <w:t>dòng</w:t>
+      </w:r>
+      <w:proofErr w:type="spellEnd"/>
+      <w:r>
+        <w:t xml:space="preserve"> </w:t>
+      </w:r>
+      <w:proofErr w:type="spellStart"/>
+      <w:r>
+        <w:t>đó</w:t>
+      </w:r>
+      <w:proofErr w:type="spellEnd"/>
+      <w:r>
+        <w:t>):</w:t>
+      </w:r>
+    </w:p>
+    <w:p>
+      <w:pPr>
+        <w:numPr>
+          <w:ilvl w:val="0"/>
+          <w:numId w:val="18"/>
+        </w:numPr>
+      </w:pPr>
+      <w:proofErr w:type="spellStart"/>
+      <w:r>
+        <w:rPr>
+          <w:b/>
+          <w:bCs/>
+        </w:rPr>
+        <w:t>Người</w:t>
+      </w:r>
+      <w:proofErr w:type="spellEnd"/>
+      <w:r>
+        <w:rPr>
+          <w:b/>
+          <w:bCs/>
+        </w:rPr>
+        <w:t xml:space="preserve"> 2 (</w:t>
+      </w:r>
+      <w:proofErr w:type="spellStart"/>
+      <w:r>
+        <w:rPr>
+          <w:b/>
+          <w:bCs/>
+        </w:rPr>
+        <w:t>Hóa</w:t>
+      </w:r>
+      <w:proofErr w:type="spellEnd"/>
+      <w:r>
+        <w:rPr>
+          <w:b/>
+          <w:bCs/>
+        </w:rPr>
+        <w:t xml:space="preserve"> </w:t>
+      </w:r>
+      <w:proofErr w:type="spellStart"/>
+      <w:r>
+        <w:rPr>
+          <w:b/>
+          <w:bCs/>
+        </w:rPr>
+        <w:t>đơn</w:t>
+      </w:r>
+      <w:proofErr w:type="spellEnd"/>
+      <w:r>
+        <w:rPr>
+          <w:b/>
+          <w:bCs/>
+        </w:rPr>
+        <w:t xml:space="preserve"> &amp; </w:t>
+      </w:r>
+      <w:proofErr w:type="spellStart"/>
+      <w:r>
+        <w:rPr>
+          <w:b/>
+          <w:bCs/>
+        </w:rPr>
+        <w:t>Lịch</w:t>
+      </w:r>
+      <w:proofErr w:type="spellEnd"/>
+      <w:r>
+        <w:rPr>
+          <w:b/>
+          <w:bCs/>
+        </w:rPr>
+        <w:t xml:space="preserve"> </w:t>
+      </w:r>
+      <w:proofErr w:type="spellStart"/>
+      <w:r>
+        <w:rPr>
+          <w:b/>
+          <w:bCs/>
+        </w:rPr>
+        <w:t>sử</w:t>
+      </w:r>
+      <w:proofErr w:type="spellEnd"/>
+      <w:r>
+        <w:rPr>
+          <w:b/>
+          <w:bCs/>
+        </w:rPr>
+        <w:t xml:space="preserve"> GD):</w:t>
+      </w:r>
+    </w:p>
+    <w:p>
+      <w:r>
+        <w:t>Bash</w:t>
+      </w:r>
+    </w:p>
+    <w:p>
+      <w:r>
+        <w:t>git checkout -b feature/bill-transaction</w:t>
+      </w:r>
+    </w:p>
+    <w:p>
+      <w:pPr>
+        <w:numPr>
+          <w:ilvl w:val="0"/>
+          <w:numId w:val="18"/>
+        </w:numPr>
+      </w:pPr>
+      <w:proofErr w:type="spellStart"/>
+      <w:r>
+        <w:rPr>
+          <w:b/>
+          <w:bCs/>
+        </w:rPr>
+        <w:t>Người</w:t>
+      </w:r>
+      <w:proofErr w:type="spellEnd"/>
+      <w:r>
+        <w:rPr>
+          <w:b/>
+          <w:bCs/>
+        </w:rPr>
+        <w:t xml:space="preserve"> 3 (</w:t>
+      </w:r>
+      <w:proofErr w:type="spellStart"/>
+      <w:r>
+        <w:rPr>
+          <w:b/>
+          <w:bCs/>
+        </w:rPr>
+        <w:t>Tiết</w:t>
+      </w:r>
+      <w:proofErr w:type="spellEnd"/>
+      <w:r>
+        <w:rPr>
+          <w:b/>
+          <w:bCs/>
+        </w:rPr>
+        <w:t xml:space="preserve"> </w:t>
+      </w:r>
+      <w:proofErr w:type="spellStart"/>
+      <w:r>
+        <w:rPr>
+          <w:b/>
+          <w:bCs/>
+        </w:rPr>
+        <w:t>kiệm</w:t>
+      </w:r>
+      <w:proofErr w:type="spellEnd"/>
+      <w:r>
+        <w:rPr>
+          <w:b/>
+          <w:bCs/>
+        </w:rPr>
+        <w:t xml:space="preserve"> &amp; Admin):</w:t>
+      </w:r>
+    </w:p>
+    <w:p>
+      <w:r>
+        <w:t>Bash</w:t>
+      </w:r>
+    </w:p>
+    <w:p>
+      <w:r>
+        <w:t>git checkout -b feature/saving-admin</w:t>
+      </w:r>
+    </w:p>
+    <w:p>
+      <w:pPr>
+        <w:numPr>
+          <w:ilvl w:val="0"/>
+          <w:numId w:val="19"/>
+        </w:numPr>
+      </w:pPr>
+      <w:r>
+        <w:rPr>
+          <w:b/>
+          <w:bCs/>
+        </w:rPr>
+        <w:t xml:space="preserve">Quy </w:t>
+      </w:r>
+      <w:proofErr w:type="spellStart"/>
+      <w:r>
+        <w:rPr>
+          <w:b/>
+          <w:bCs/>
+        </w:rPr>
+        <w:t>tắc</w:t>
+      </w:r>
+      <w:proofErr w:type="spellEnd"/>
+      <w:r>
+        <w:rPr>
+          <w:b/>
+          <w:bCs/>
+        </w:rPr>
+        <w:t xml:space="preserve"> </w:t>
+      </w:r>
+      <w:proofErr w:type="spellStart"/>
+      <w:r>
+        <w:rPr>
+          <w:b/>
+          <w:bCs/>
+        </w:rPr>
+        <w:t>làm</w:t>
+      </w:r>
+      <w:proofErr w:type="spellEnd"/>
+      <w:r>
+        <w:rPr>
+          <w:b/>
+          <w:bCs/>
+        </w:rPr>
+        <w:t xml:space="preserve"> </w:t>
+      </w:r>
+      <w:proofErr w:type="spellStart"/>
+      <w:r>
+        <w:rPr>
+          <w:b/>
+          <w:bCs/>
+        </w:rPr>
+        <w:t>việc</w:t>
+      </w:r>
+      <w:proofErr w:type="spellEnd"/>
+      <w:r>
+        <w:rPr>
+          <w:b/>
+          <w:bCs/>
+        </w:rPr>
+        <w:t xml:space="preserve"> </w:t>
+      </w:r>
+      <w:proofErr w:type="spellStart"/>
+      <w:r>
+        <w:rPr>
+          <w:b/>
+          <w:bCs/>
+        </w:rPr>
+        <w:t>hàng</w:t>
+      </w:r>
+      <w:proofErr w:type="spellEnd"/>
+      <w:r>
+        <w:rPr>
+          <w:b/>
+          <w:bCs/>
+        </w:rPr>
+        <w:t xml:space="preserve"> </w:t>
+      </w:r>
+      <w:proofErr w:type="spellStart"/>
+      <w:r>
+        <w:rPr>
+          <w:b/>
+          <w:bCs/>
+        </w:rPr>
+        <w:t>ngày</w:t>
+      </w:r>
+      <w:proofErr w:type="spellEnd"/>
+      <w:r>
+        <w:rPr>
+          <w:b/>
+          <w:bCs/>
+        </w:rPr>
+        <w:t>:</w:t>
+      </w:r>
+    </w:p>
+    <w:p>
+      <w:pPr>
+        <w:numPr>
+          <w:ilvl w:val="0"/>
+          <w:numId w:val="20"/>
+        </w:numPr>
+      </w:pPr>
+      <w:proofErr w:type="spellStart"/>
+      <w:r>
+        <w:t>Chỉ</w:t>
+      </w:r>
+      <w:proofErr w:type="spellEnd"/>
+      <w:r>
+        <w:t xml:space="preserve"> code </w:t>
+      </w:r>
+      <w:proofErr w:type="spellStart"/>
+      <w:r>
+        <w:t>trên</w:t>
+      </w:r>
+      <w:proofErr w:type="spellEnd"/>
+      <w:r>
+        <w:t xml:space="preserve"> </w:t>
+      </w:r>
+      <w:proofErr w:type="spellStart"/>
+      <w:r>
+        <w:t>các</w:t>
+      </w:r>
+      <w:proofErr w:type="spellEnd"/>
+      <w:r>
+        <w:t xml:space="preserve"> file </w:t>
+      </w:r>
+      <w:proofErr w:type="spellStart"/>
+      <w:r>
+        <w:t>được</w:t>
+      </w:r>
+      <w:proofErr w:type="spellEnd"/>
+      <w:r>
+        <w:t xml:space="preserve"> </w:t>
+      </w:r>
+      <w:proofErr w:type="spellStart"/>
+      <w:r>
+        <w:t>phân</w:t>
+      </w:r>
+      <w:proofErr w:type="spellEnd"/>
+      <w:r>
+        <w:t xml:space="preserve"> </w:t>
+      </w:r>
+      <w:proofErr w:type="spellStart"/>
+      <w:r>
+        <w:t>công</w:t>
+      </w:r>
+      <w:proofErr w:type="spellEnd"/>
+      <w:r>
+        <w:t xml:space="preserve">, </w:t>
+      </w:r>
+      <w:proofErr w:type="spellStart"/>
+      <w:r>
+        <w:rPr>
+          <w:b/>
+          <w:bCs/>
+        </w:rPr>
+        <w:t>tuyệt</w:t>
+      </w:r>
+      <w:proofErr w:type="spellEnd"/>
+      <w:r>
+        <w:rPr>
+          <w:b/>
+          <w:bCs/>
+        </w:rPr>
+        <w:t xml:space="preserve"> </w:t>
+      </w:r>
+      <w:proofErr w:type="spellStart"/>
+      <w:r>
+        <w:rPr>
+          <w:b/>
+          <w:bCs/>
+        </w:rPr>
+        <w:t>đối</w:t>
+      </w:r>
+      <w:proofErr w:type="spellEnd"/>
+      <w:r>
+        <w:rPr>
+          <w:b/>
+          <w:bCs/>
+        </w:rPr>
+        <w:t xml:space="preserve"> </w:t>
+      </w:r>
+      <w:proofErr w:type="spellStart"/>
+      <w:r>
+        <w:rPr>
+          <w:b/>
+          <w:bCs/>
+        </w:rPr>
+        <w:t>không</w:t>
+      </w:r>
+      <w:proofErr w:type="spellEnd"/>
+      <w:r>
+        <w:rPr>
+          <w:b/>
+          <w:bCs/>
+        </w:rPr>
+        <w:t xml:space="preserve"> </w:t>
+      </w:r>
+      <w:proofErr w:type="spellStart"/>
+      <w:r>
+        <w:rPr>
+          <w:b/>
+          <w:bCs/>
+        </w:rPr>
+        <w:t>sửa</w:t>
+      </w:r>
+      <w:proofErr w:type="spellEnd"/>
+      <w:r>
+        <w:rPr>
+          <w:b/>
+          <w:bCs/>
+        </w:rPr>
+        <w:t xml:space="preserve"> </w:t>
+      </w:r>
+      <w:proofErr w:type="spellStart"/>
+      <w:r>
+        <w:rPr>
+          <w:b/>
+          <w:bCs/>
+        </w:rPr>
+        <w:t>các</w:t>
+      </w:r>
+      <w:proofErr w:type="spellEnd"/>
+      <w:r>
+        <w:rPr>
+          <w:b/>
+          <w:bCs/>
+        </w:rPr>
+        <w:t xml:space="preserve"> file </w:t>
+      </w:r>
+      <w:proofErr w:type="spellStart"/>
+      <w:r>
+        <w:rPr>
+          <w:b/>
+          <w:bCs/>
+        </w:rPr>
+        <w:t>trong</w:t>
+      </w:r>
+      <w:proofErr w:type="spellEnd"/>
+      <w:r>
+        <w:rPr>
+          <w:b/>
+          <w:bCs/>
+        </w:rPr>
+        <w:t xml:space="preserve"> </w:t>
+      </w:r>
+      <w:proofErr w:type="spellStart"/>
+      <w:r>
+        <w:rPr>
+          <w:b/>
+          <w:bCs/>
+        </w:rPr>
+        <w:t>thư</w:t>
+      </w:r>
+      <w:proofErr w:type="spellEnd"/>
+      <w:r>
+        <w:rPr>
+          <w:b/>
+          <w:bCs/>
+        </w:rPr>
+        <w:t xml:space="preserve"> </w:t>
+      </w:r>
+      <w:proofErr w:type="spellStart"/>
+      <w:r>
+        <w:rPr>
+          <w:b/>
+          <w:bCs/>
+        </w:rPr>
+        <w:t>mục</w:t>
+      </w:r>
+      <w:proofErr w:type="spellEnd"/>
+      <w:r>
+        <w:rPr>
+          <w:b/>
+          <w:bCs/>
+        </w:rPr>
+        <w:t xml:space="preserve"> common/</w:t>
+      </w:r>
+      <w:r>
+        <w:t>.</w:t>
+      </w:r>
+    </w:p>
+    <w:p>
+      <w:pPr>
+        <w:numPr>
+          <w:ilvl w:val="0"/>
+          <w:numId w:val="20"/>
+        </w:numPr>
+      </w:pPr>
+      <w:proofErr w:type="spellStart"/>
+      <w:r>
+        <w:t>Cuối</w:t>
+      </w:r>
+      <w:proofErr w:type="spellEnd"/>
+      <w:r>
+        <w:t xml:space="preserve"> </w:t>
+      </w:r>
+      <w:proofErr w:type="spellStart"/>
+      <w:r>
+        <w:t>ngày</w:t>
+      </w:r>
+      <w:proofErr w:type="spellEnd"/>
+      <w:r>
+        <w:t xml:space="preserve"> </w:t>
+      </w:r>
+      <w:proofErr w:type="spellStart"/>
+      <w:r>
+        <w:t>đẩy</w:t>
+      </w:r>
+      <w:proofErr w:type="spellEnd"/>
+      <w:r>
+        <w:t xml:space="preserve"> code </w:t>
+      </w:r>
+      <w:proofErr w:type="spellStart"/>
+      <w:r>
+        <w:t>lên</w:t>
+      </w:r>
+      <w:proofErr w:type="spellEnd"/>
+      <w:r>
+        <w:t xml:space="preserve"> </w:t>
+      </w:r>
+      <w:proofErr w:type="spellStart"/>
+      <w:r>
+        <w:t>nhánh</w:t>
+      </w:r>
+      <w:proofErr w:type="spellEnd"/>
+      <w:r>
+        <w:t xml:space="preserve"> </w:t>
+      </w:r>
+      <w:proofErr w:type="spellStart"/>
+      <w:r>
+        <w:t>của</w:t>
+      </w:r>
+      <w:proofErr w:type="spellEnd"/>
+      <w:r>
+        <w:t xml:space="preserve"> </w:t>
+      </w:r>
+      <w:proofErr w:type="spellStart"/>
+      <w:r>
+        <w:t>mình</w:t>
+      </w:r>
+      <w:proofErr w:type="spellEnd"/>
+      <w:r>
+        <w:t>:</w:t>
+      </w:r>
+    </w:p>
+    <w:p>
+      <w:r>
+        <w:t>Bash</w:t>
+      </w:r>
+    </w:p>
+    <w:p>
+      <w:r>
+        <w:t xml:space="preserve">git </w:t>
+      </w:r>
+      <w:proofErr w:type="gramStart"/>
+      <w:r>
+        <w:t>add .</w:t>
+      </w:r>
+      <w:proofErr w:type="gramEnd"/>
+    </w:p>
+    <w:p>
+      <w:r>
+        <w:t>git commit -m "</w:t>
+      </w:r>
+      <w:proofErr w:type="spellStart"/>
+      <w:r>
+        <w:t>mô</w:t>
+      </w:r>
+      <w:proofErr w:type="spellEnd"/>
+      <w:r>
+        <w:t xml:space="preserve"> </w:t>
+      </w:r>
+      <w:proofErr w:type="spellStart"/>
+      <w:r>
+        <w:t>tả</w:t>
+      </w:r>
+      <w:proofErr w:type="spellEnd"/>
+      <w:r>
+        <w:t xml:space="preserve"> </w:t>
+      </w:r>
+      <w:proofErr w:type="spellStart"/>
+      <w:r>
+        <w:t>việc</w:t>
+      </w:r>
+      <w:proofErr w:type="spellEnd"/>
+      <w:r>
+        <w:t xml:space="preserve"> </w:t>
+      </w:r>
+      <w:proofErr w:type="spellStart"/>
+      <w:r>
+        <w:t>vừa</w:t>
+      </w:r>
+      <w:proofErr w:type="spellEnd"/>
+      <w:r>
+        <w:t xml:space="preserve"> </w:t>
+      </w:r>
+      <w:proofErr w:type="spellStart"/>
+      <w:r>
+        <w:t>làm</w:t>
+      </w:r>
+      <w:proofErr w:type="spellEnd"/>
+      <w:r>
+        <w:t xml:space="preserve"> </w:t>
+      </w:r>
+      <w:proofErr w:type="spellStart"/>
+      <w:r>
+        <w:t>hôm</w:t>
+      </w:r>
+      <w:proofErr w:type="spellEnd"/>
+      <w:r>
+        <w:t xml:space="preserve"> nay"</w:t>
+      </w:r>
+    </w:p>
+    <w:p>
+      <w:r>
+        <w:t>git push origin &lt;</w:t>
+      </w:r>
+      <w:proofErr w:type="spellStart"/>
+      <w:r>
+        <w:t>tên_nhánh_của_mình</w:t>
+      </w:r>
+      <w:proofErr w:type="spellEnd"/>
+      <w:r>
+        <w:t>&gt;</w:t>
+      </w:r>
+    </w:p>
+    <w:p>
+      <w:pPr>
+        <w:numPr>
+          <w:ilvl w:val="0"/>
+          <w:numId w:val="20"/>
+        </w:numPr>
+      </w:pPr>
+      <w:proofErr w:type="spellStart"/>
+      <w:r>
+        <w:rPr>
+          <w:b/>
+          <w:bCs/>
+        </w:rPr>
+        <w:t>Tuyệt</w:t>
+      </w:r>
+      <w:proofErr w:type="spellEnd"/>
+      <w:r>
+        <w:rPr>
+          <w:b/>
+          <w:bCs/>
+        </w:rPr>
+        <w:t xml:space="preserve"> </w:t>
+      </w:r>
+      <w:proofErr w:type="spellStart"/>
+      <w:r>
+        <w:rPr>
+          <w:b/>
+          <w:bCs/>
+        </w:rPr>
+        <w:t>đối</w:t>
+      </w:r>
+      <w:proofErr w:type="spellEnd"/>
+      <w:r>
+        <w:rPr>
+          <w:b/>
+          <w:bCs/>
+        </w:rPr>
+        <w:t xml:space="preserve"> KHÔNG push </w:t>
+      </w:r>
+      <w:proofErr w:type="spellStart"/>
+      <w:r>
+        <w:rPr>
+          <w:b/>
+          <w:bCs/>
+        </w:rPr>
+        <w:t>thẳng</w:t>
+      </w:r>
+      <w:proofErr w:type="spellEnd"/>
+      <w:r>
+        <w:rPr>
+          <w:b/>
+          <w:bCs/>
+        </w:rPr>
+        <w:t xml:space="preserve"> </w:t>
+      </w:r>
+      <w:proofErr w:type="spellStart"/>
+      <w:r>
+        <w:rPr>
+          <w:b/>
+          <w:bCs/>
+        </w:rPr>
+        <w:t>lên</w:t>
+      </w:r>
+      <w:proofErr w:type="spellEnd"/>
+      <w:r>
+        <w:rPr>
+          <w:b/>
+          <w:bCs/>
+        </w:rPr>
+        <w:t xml:space="preserve"> main</w:t>
+      </w:r>
+      <w:r>
+        <w:t xml:space="preserve">. Khi </w:t>
+      </w:r>
+      <w:proofErr w:type="spellStart"/>
+      <w:r>
+        <w:t>nào</w:t>
+      </w:r>
+      <w:proofErr w:type="spellEnd"/>
+      <w:r>
+        <w:t xml:space="preserve"> </w:t>
+      </w:r>
+      <w:proofErr w:type="spellStart"/>
+      <w:r>
+        <w:t>xong</w:t>
+      </w:r>
+      <w:proofErr w:type="spellEnd"/>
+      <w:r>
+        <w:t xml:space="preserve"> </w:t>
+      </w:r>
+      <w:proofErr w:type="spellStart"/>
+      <w:r>
+        <w:t>tính</w:t>
+      </w:r>
+      <w:proofErr w:type="spellEnd"/>
+      <w:r>
+        <w:t xml:space="preserve"> </w:t>
+      </w:r>
+      <w:proofErr w:type="spellStart"/>
+      <w:r>
+        <w:t>năng</w:t>
+      </w:r>
+      <w:proofErr w:type="spellEnd"/>
+      <w:r>
+        <w:t xml:space="preserve"> </w:t>
+      </w:r>
+      <w:proofErr w:type="spellStart"/>
+      <w:r>
+        <w:t>thì</w:t>
+      </w:r>
+      <w:proofErr w:type="spellEnd"/>
+      <w:r>
+        <w:t xml:space="preserve"> </w:t>
+      </w:r>
+      <w:proofErr w:type="spellStart"/>
+      <w:r>
+        <w:t>lên</w:t>
+      </w:r>
+      <w:proofErr w:type="spellEnd"/>
+      <w:r>
+        <w:t xml:space="preserve"> GitHub </w:t>
+      </w:r>
+      <w:proofErr w:type="spellStart"/>
+      <w:r>
+        <w:t>tạo</w:t>
+      </w:r>
+      <w:proofErr w:type="spellEnd"/>
+      <w:r>
+        <w:t xml:space="preserve"> Pull Request </w:t>
+      </w:r>
+      <w:proofErr w:type="spellStart"/>
+      <w:r>
+        <w:t>để</w:t>
+      </w:r>
+      <w:proofErr w:type="spellEnd"/>
+      <w:r>
+        <w:t xml:space="preserve"> </w:t>
+      </w:r>
+      <w:proofErr w:type="spellStart"/>
+      <w:r>
+        <w:t>trưởng</w:t>
+      </w:r>
+      <w:proofErr w:type="spellEnd"/>
+      <w:r>
+        <w:t xml:space="preserve"> </w:t>
+      </w:r>
+      <w:proofErr w:type="spellStart"/>
+      <w:r>
+        <w:t>nhóm</w:t>
+      </w:r>
+      <w:proofErr w:type="spellEnd"/>
+      <w:r>
+        <w:t xml:space="preserve"> </w:t>
+      </w:r>
+      <w:proofErr w:type="spellStart"/>
+      <w:r>
+        <w:t>duyệt</w:t>
+      </w:r>
+      <w:proofErr w:type="spellEnd"/>
+      <w:r>
+        <w:t>.</w:t>
+      </w:r>
+    </w:p>
+    <w:p>
+      <w:r>
+        <w:t xml:space="preserve">Như </w:t>
+      </w:r>
+      <w:proofErr w:type="spellStart"/>
+      <w:r>
+        <w:t>vậy</w:t>
+      </w:r>
+      <w:proofErr w:type="spellEnd"/>
+      <w:r>
+        <w:t xml:space="preserve"> </w:t>
+      </w:r>
+      <w:proofErr w:type="spellStart"/>
+      <w:r>
+        <w:t>là</w:t>
+      </w:r>
+      <w:proofErr w:type="spellEnd"/>
+      <w:r>
+        <w:t xml:space="preserve"> </w:t>
+      </w:r>
+      <w:proofErr w:type="spellStart"/>
+      <w:r>
+        <w:t>xong</w:t>
+      </w:r>
+      <w:proofErr w:type="spellEnd"/>
+      <w:r>
+        <w:t xml:space="preserve"> </w:t>
+      </w:r>
+      <w:proofErr w:type="spellStart"/>
+      <w:r>
+        <w:t>phần</w:t>
+      </w:r>
+      <w:proofErr w:type="spellEnd"/>
+      <w:r>
+        <w:t xml:space="preserve"> </w:t>
+      </w:r>
+      <w:proofErr w:type="spellStart"/>
+      <w:r>
+        <w:t>thiết</w:t>
+      </w:r>
+      <w:proofErr w:type="spellEnd"/>
+      <w:r>
+        <w:t xml:space="preserve"> </w:t>
+      </w:r>
+      <w:proofErr w:type="spellStart"/>
+      <w:r>
+        <w:t>lập</w:t>
+      </w:r>
+      <w:proofErr w:type="spellEnd"/>
+      <w:r>
+        <w:t xml:space="preserve">! </w:t>
+      </w:r>
+      <w:proofErr w:type="spellStart"/>
+      <w:r>
+        <w:t>Bây</w:t>
+      </w:r>
+      <w:proofErr w:type="spellEnd"/>
+      <w:r>
+        <w:t xml:space="preserve"> </w:t>
+      </w:r>
+      <w:proofErr w:type="spellStart"/>
+      <w:r>
+        <w:t>giờ</w:t>
+      </w:r>
+      <w:proofErr w:type="spellEnd"/>
+      <w:r>
+        <w:t xml:space="preserve"> </w:t>
+      </w:r>
+      <w:proofErr w:type="spellStart"/>
+      <w:r>
+        <w:t>bạn</w:t>
+      </w:r>
+      <w:proofErr w:type="spellEnd"/>
+      <w:r>
+        <w:t xml:space="preserve"> </w:t>
+      </w:r>
+      <w:proofErr w:type="spellStart"/>
+      <w:r>
+        <w:t>chỉ</w:t>
+      </w:r>
+      <w:proofErr w:type="spellEnd"/>
+      <w:r>
+        <w:t xml:space="preserve"> </w:t>
+      </w:r>
+      <w:proofErr w:type="spellStart"/>
+      <w:r>
+        <w:t>việc</w:t>
+      </w:r>
+      <w:proofErr w:type="spellEnd"/>
+      <w:r>
+        <w:t xml:space="preserve"> quay </w:t>
+      </w:r>
+      <w:proofErr w:type="spellStart"/>
+      <w:r>
+        <w:t>lại</w:t>
+      </w:r>
+      <w:proofErr w:type="spellEnd"/>
+      <w:r>
+        <w:t xml:space="preserve"> IntelliJ IDEA </w:t>
+      </w:r>
+      <w:proofErr w:type="spellStart"/>
+      <w:r>
+        <w:t>và</w:t>
+      </w:r>
+      <w:proofErr w:type="spellEnd"/>
+      <w:r>
+        <w:t xml:space="preserve"> </w:t>
+      </w:r>
+      <w:proofErr w:type="spellStart"/>
+      <w:r>
+        <w:t>bắt</w:t>
+      </w:r>
+      <w:proofErr w:type="spellEnd"/>
+      <w:r>
+        <w:t xml:space="preserve"> </w:t>
+      </w:r>
+      <w:proofErr w:type="spellStart"/>
+      <w:r>
+        <w:t>đầu</w:t>
+      </w:r>
+      <w:proofErr w:type="spellEnd"/>
+      <w:r>
+        <w:t xml:space="preserve"> code </w:t>
+      </w:r>
+      <w:proofErr w:type="spellStart"/>
+      <w:r>
+        <w:t>phần</w:t>
+      </w:r>
+      <w:proofErr w:type="spellEnd"/>
+      <w:r>
+        <w:t xml:space="preserve"> </w:t>
+      </w:r>
+      <w:proofErr w:type="spellStart"/>
+      <w:r>
+        <w:t>của</w:t>
+      </w:r>
+      <w:proofErr w:type="spellEnd"/>
+      <w:r>
+        <w:t xml:space="preserve"> </w:t>
+      </w:r>
+      <w:proofErr w:type="spellStart"/>
+      <w:r>
+        <w:t>Người</w:t>
+      </w:r>
+      <w:proofErr w:type="spellEnd"/>
+      <w:r>
+        <w:t xml:space="preserve"> 1 </w:t>
+      </w:r>
+      <w:proofErr w:type="spellStart"/>
+      <w:r>
+        <w:t>trên</w:t>
+      </w:r>
+      <w:proofErr w:type="spellEnd"/>
+      <w:r>
+        <w:t xml:space="preserve"> </w:t>
+      </w:r>
+      <w:proofErr w:type="spellStart"/>
+      <w:r>
+        <w:t>nhánh</w:t>
+      </w:r>
+      <w:proofErr w:type="spellEnd"/>
+      <w:r>
+        <w:t xml:space="preserve"> feature/core-auth-transfer.</w:t>
+      </w:r>
+    </w:p>
+    <w:p/>
     <w:p/>
     <w:sectPr>
       <w:pgSz w:w="12240" w:h="15840"/>
@@ -9625,6 +12556,417 @@
 <file path=word/numbering.xml><?xml version="1.0" encoding="utf-8"?>
 <w:numbering xmlns:wpc="http://schemas.microsoft.com/office/word/2010/wordprocessingCanvas" xmlns:cx="http://schemas.microsoft.com/office/drawing/2014/chartex" xmlns:cx1="http://schemas.microsoft.com/office/drawing/2015/9/8/chartex" xmlns:cx2="http://schemas.microsoft.com/office/drawing/2015/10/21/chartex" xmlns:cx3="http://schemas.microsoft.com/office/drawing/2016/5/9/chartex" xmlns:cx4="http://schemas.microsoft.com/office/drawing/2016/5/10/chartex" xmlns:cx5="http://schemas.microsoft.com/office/drawing/2016/5/11/chartex" xmlns:cx6="http://schemas.microsoft.com/office/drawing/2016/5/12/chartex" xmlns:cx7="http://schemas.microsoft.com/office/drawing/2016/5/13/chartex" xmlns:cx8="http://schemas.microsoft.com/office/drawing/2016/5/14/chartex" xmlns:mc="http://schemas.openxmlformats.org/markup-compatibility/2006" xmlns:aink="http://schemas.microsoft.com/office/drawing/2016/ink" xmlns:am3d="http://schemas.microsoft.com/office/drawing/2017/model3d" xmlns:o="urn:schemas-microsoft-com:office:office" xmlns:oel="http://schemas.microsoft.com/office/2019/extlst" xmlns:r="http://schemas.openxmlformats.org/officeDocument/2006/relationships" xmlns:m="http://schemas.openxmlformats.org/officeDocument/2006/math" xmlns:v="urn:schemas-microsoft-com:vml" xmlns:wp14="http://schemas.microsoft.com/office/word/2010/wordprocessingDrawing" xmlns:wp="http://schemas.openxmlformats.org/drawingml/2006/wordprocessingDrawing" xmlns:w10="urn:schemas-microsoft-com:office:word" xmlns:w="http://schemas.openxmlformats.org/wordprocessingml/2006/main" xmlns:w14="http://schemas.microsoft.com/office/word/2010/wordml" xmlns:w15="http://schemas.microsoft.com/office/word/2012/wordml" xmlns:w16cex="http://schemas.microsoft.com/office/word/2018/wordml/cex" xmlns:w16cid="http://schemas.microsoft.com/office/word/2016/wordml/cid" xmlns:w16="http://schemas.microsoft.com/office/word/2018/wordml" xmlns:w16du="http://schemas.microsoft.com/office/word/2023/wordml/word16du" xmlns:w16sdtdh="http://schemas.microsoft.com/office/word/2020/wordml/sdtdatahash" xmlns:w16sdtfl="http://schemas.microsoft.com/office/word/2024/wordml/sdtformatlock" xmlns:w16se="http://schemas.microsoft.com/office/word/2015/wordml/symex" xmlns:wpg="http://schemas.microsoft.com/office/word/2010/wordprocessingGroup" xmlns:wpi="http://schemas.microsoft.com/office/word/2010/wordprocessingInk" xmlns:wne="http://schemas.microsoft.com/office/word/2006/wordml" xmlns:wps="http://schemas.microsoft.com/office/word/2010/wordprocessingShape" mc:Ignorable="w14 w15 w16se w16cid w16 w16cex w16sdtdh w16sdtfl w16du wp14">
   <w:abstractNum w:abstractNumId="0" w15:restartNumberingAfterBreak="0">
+    <w:nsid w:val="049D20CE"/>
+    <w:multiLevelType w:val="multilevel"/>
+    <w:tmpl w:val="913877BE"/>
+    <w:lvl w:ilvl="0">
+      <w:start w:val="3"/>
+      <w:numFmt w:val="decimal"/>
+      <w:lvlText w:val="%1."/>
+      <w:lvlJc w:val="left"/>
+      <w:pPr>
+        <w:tabs>
+          <w:tab w:val="num" w:pos="720"/>
+        </w:tabs>
+        <w:ind w:left="720" w:hanging="360"/>
+      </w:pPr>
+    </w:lvl>
+    <w:lvl w:ilvl="1" w:tentative="1">
+      <w:start w:val="1"/>
+      <w:numFmt w:val="decimal"/>
+      <w:lvlText w:val="%2."/>
+      <w:lvlJc w:val="left"/>
+      <w:pPr>
+        <w:tabs>
+          <w:tab w:val="num" w:pos="1440"/>
+        </w:tabs>
+        <w:ind w:left="1440" w:hanging="360"/>
+      </w:pPr>
+    </w:lvl>
+    <w:lvl w:ilvl="2" w:tentative="1">
+      <w:start w:val="1"/>
+      <w:numFmt w:val="decimal"/>
+      <w:lvlText w:val="%3."/>
+      <w:lvlJc w:val="left"/>
+      <w:pPr>
+        <w:tabs>
+          <w:tab w:val="num" w:pos="2160"/>
+        </w:tabs>
+        <w:ind w:left="2160" w:hanging="360"/>
+      </w:pPr>
+    </w:lvl>
+    <w:lvl w:ilvl="3" w:tentative="1">
+      <w:start w:val="1"/>
+      <w:numFmt w:val="decimal"/>
+      <w:lvlText w:val="%4."/>
+      <w:lvlJc w:val="left"/>
+      <w:pPr>
+        <w:tabs>
+          <w:tab w:val="num" w:pos="2880"/>
+        </w:tabs>
+        <w:ind w:left="2880" w:hanging="360"/>
+      </w:pPr>
+    </w:lvl>
+    <w:lvl w:ilvl="4" w:tentative="1">
+      <w:start w:val="1"/>
+      <w:numFmt w:val="decimal"/>
+      <w:lvlText w:val="%5."/>
+      <w:lvlJc w:val="left"/>
+      <w:pPr>
+        <w:tabs>
+          <w:tab w:val="num" w:pos="3600"/>
+        </w:tabs>
+        <w:ind w:left="3600" w:hanging="360"/>
+      </w:pPr>
+    </w:lvl>
+    <w:lvl w:ilvl="5" w:tentative="1">
+      <w:start w:val="1"/>
+      <w:numFmt w:val="decimal"/>
+      <w:lvlText w:val="%6."/>
+      <w:lvlJc w:val="left"/>
+      <w:pPr>
+        <w:tabs>
+          <w:tab w:val="num" w:pos="4320"/>
+        </w:tabs>
+        <w:ind w:left="4320" w:hanging="360"/>
+      </w:pPr>
+    </w:lvl>
+    <w:lvl w:ilvl="6" w:tentative="1">
+      <w:start w:val="1"/>
+      <w:numFmt w:val="decimal"/>
+      <w:lvlText w:val="%7."/>
+      <w:lvlJc w:val="left"/>
+      <w:pPr>
+        <w:tabs>
+          <w:tab w:val="num" w:pos="5040"/>
+        </w:tabs>
+        <w:ind w:left="5040" w:hanging="360"/>
+      </w:pPr>
+    </w:lvl>
+    <w:lvl w:ilvl="7" w:tentative="1">
+      <w:start w:val="1"/>
+      <w:numFmt w:val="decimal"/>
+      <w:lvlText w:val="%8."/>
+      <w:lvlJc w:val="left"/>
+      <w:pPr>
+        <w:tabs>
+          <w:tab w:val="num" w:pos="5760"/>
+        </w:tabs>
+        <w:ind w:left="5760" w:hanging="360"/>
+      </w:pPr>
+    </w:lvl>
+    <w:lvl w:ilvl="8" w:tentative="1">
+      <w:start w:val="1"/>
+      <w:numFmt w:val="decimal"/>
+      <w:lvlText w:val="%9."/>
+      <w:lvlJc w:val="left"/>
+      <w:pPr>
+        <w:tabs>
+          <w:tab w:val="num" w:pos="6480"/>
+        </w:tabs>
+        <w:ind w:left="6480" w:hanging="360"/>
+      </w:pPr>
+    </w:lvl>
+  </w:abstractNum>
+  <w:abstractNum w:abstractNumId="1" w15:restartNumberingAfterBreak="0">
+    <w:nsid w:val="137D5C4C"/>
+    <w:multiLevelType w:val="multilevel"/>
+    <w:tmpl w:val="11F09338"/>
+    <w:lvl w:ilvl="0">
+      <w:start w:val="1"/>
+      <w:numFmt w:val="bullet"/>
+      <w:lvlText w:val=""/>
+      <w:lvlJc w:val="left"/>
+      <w:pPr>
+        <w:tabs>
+          <w:tab w:val="num" w:pos="720"/>
+        </w:tabs>
+        <w:ind w:left="720" w:hanging="360"/>
+      </w:pPr>
+      <w:rPr>
+        <w:rFonts w:ascii="Symbol" w:hAnsi="Symbol" w:hint="default"/>
+        <w:sz w:val="20"/>
+      </w:rPr>
+    </w:lvl>
+    <w:lvl w:ilvl="1" w:tentative="1">
+      <w:start w:val="1"/>
+      <w:numFmt w:val="bullet"/>
+      <w:lvlText w:val="o"/>
+      <w:lvlJc w:val="left"/>
+      <w:pPr>
+        <w:tabs>
+          <w:tab w:val="num" w:pos="1440"/>
+        </w:tabs>
+        <w:ind w:left="1440" w:hanging="360"/>
+      </w:pPr>
+      <w:rPr>
+        <w:rFonts w:ascii="Courier New" w:hAnsi="Courier New" w:hint="default"/>
+        <w:sz w:val="20"/>
+      </w:rPr>
+    </w:lvl>
+    <w:lvl w:ilvl="2" w:tentative="1">
+      <w:start w:val="1"/>
+      <w:numFmt w:val="bullet"/>
+      <w:lvlText w:val=""/>
+      <w:lvlJc w:val="left"/>
+      <w:pPr>
+        <w:tabs>
+          <w:tab w:val="num" w:pos="2160"/>
+        </w:tabs>
+        <w:ind w:left="2160" w:hanging="360"/>
+      </w:pPr>
+      <w:rPr>
+        <w:rFonts w:ascii="Wingdings" w:hAnsi="Wingdings" w:hint="default"/>
+        <w:sz w:val="20"/>
+      </w:rPr>
+    </w:lvl>
+    <w:lvl w:ilvl="3" w:tentative="1">
+      <w:start w:val="1"/>
+      <w:numFmt w:val="bullet"/>
+      <w:lvlText w:val=""/>
+      <w:lvlJc w:val="left"/>
+      <w:pPr>
+        <w:tabs>
+          <w:tab w:val="num" w:pos="2880"/>
+        </w:tabs>
+        <w:ind w:left="2880" w:hanging="360"/>
+      </w:pPr>
+      <w:rPr>
+        <w:rFonts w:ascii="Wingdings" w:hAnsi="Wingdings" w:hint="default"/>
+        <w:sz w:val="20"/>
+      </w:rPr>
+    </w:lvl>
+    <w:lvl w:ilvl="4" w:tentative="1">
+      <w:start w:val="1"/>
+      <w:numFmt w:val="bullet"/>
+      <w:lvlText w:val=""/>
+      <w:lvlJc w:val="left"/>
+      <w:pPr>
+        <w:tabs>
+          <w:tab w:val="num" w:pos="3600"/>
+        </w:tabs>
+        <w:ind w:left="3600" w:hanging="360"/>
+      </w:pPr>
+      <w:rPr>
+        <w:rFonts w:ascii="Wingdings" w:hAnsi="Wingdings" w:hint="default"/>
+        <w:sz w:val="20"/>
+      </w:rPr>
+    </w:lvl>
+    <w:lvl w:ilvl="5" w:tentative="1">
+      <w:start w:val="1"/>
+      <w:numFmt w:val="bullet"/>
+      <w:lvlText w:val=""/>
+      <w:lvlJc w:val="left"/>
+      <w:pPr>
+        <w:tabs>
+          <w:tab w:val="num" w:pos="4320"/>
+        </w:tabs>
+        <w:ind w:left="4320" w:hanging="360"/>
+      </w:pPr>
+      <w:rPr>
+        <w:rFonts w:ascii="Wingdings" w:hAnsi="Wingdings" w:hint="default"/>
+        <w:sz w:val="20"/>
+      </w:rPr>
+    </w:lvl>
+    <w:lvl w:ilvl="6" w:tentative="1">
+      <w:start w:val="1"/>
+      <w:numFmt w:val="bullet"/>
+      <w:lvlText w:val=""/>
+      <w:lvlJc w:val="left"/>
+      <w:pPr>
+        <w:tabs>
+          <w:tab w:val="num" w:pos="5040"/>
+        </w:tabs>
+        <w:ind w:left="5040" w:hanging="360"/>
+      </w:pPr>
+      <w:rPr>
+        <w:rFonts w:ascii="Wingdings" w:hAnsi="Wingdings" w:hint="default"/>
+        <w:sz w:val="20"/>
+      </w:rPr>
+    </w:lvl>
+    <w:lvl w:ilvl="7" w:tentative="1">
+      <w:start w:val="1"/>
+      <w:numFmt w:val="bullet"/>
+      <w:lvlText w:val=""/>
+      <w:lvlJc w:val="left"/>
+      <w:pPr>
+        <w:tabs>
+          <w:tab w:val="num" w:pos="5760"/>
+        </w:tabs>
+        <w:ind w:left="5760" w:hanging="360"/>
+      </w:pPr>
+      <w:rPr>
+        <w:rFonts w:ascii="Wingdings" w:hAnsi="Wingdings" w:hint="default"/>
+        <w:sz w:val="20"/>
+      </w:rPr>
+    </w:lvl>
+    <w:lvl w:ilvl="8" w:tentative="1">
+      <w:start w:val="1"/>
+      <w:numFmt w:val="bullet"/>
+      <w:lvlText w:val=""/>
+      <w:lvlJc w:val="left"/>
+      <w:pPr>
+        <w:tabs>
+          <w:tab w:val="num" w:pos="6480"/>
+        </w:tabs>
+        <w:ind w:left="6480" w:hanging="360"/>
+      </w:pPr>
+      <w:rPr>
+        <w:rFonts w:ascii="Wingdings" w:hAnsi="Wingdings" w:hint="default"/>
+        <w:sz w:val="20"/>
+      </w:rPr>
+    </w:lvl>
+  </w:abstractNum>
+  <w:abstractNum w:abstractNumId="2" w15:restartNumberingAfterBreak="0">
+    <w:nsid w:val="1C243CA6"/>
+    <w:multiLevelType w:val="multilevel"/>
+    <w:tmpl w:val="DB7492D0"/>
+    <w:lvl w:ilvl="0">
+      <w:start w:val="1"/>
+      <w:numFmt w:val="bullet"/>
+      <w:lvlText w:val=""/>
+      <w:lvlJc w:val="left"/>
+      <w:pPr>
+        <w:tabs>
+          <w:tab w:val="num" w:pos="720"/>
+        </w:tabs>
+        <w:ind w:left="720" w:hanging="360"/>
+      </w:pPr>
+      <w:rPr>
+        <w:rFonts w:ascii="Symbol" w:hAnsi="Symbol" w:hint="default"/>
+        <w:sz w:val="20"/>
+      </w:rPr>
+    </w:lvl>
+    <w:lvl w:ilvl="1" w:tentative="1">
+      <w:start w:val="1"/>
+      <w:numFmt w:val="bullet"/>
+      <w:lvlText w:val="o"/>
+      <w:lvlJc w:val="left"/>
+      <w:pPr>
+        <w:tabs>
+          <w:tab w:val="num" w:pos="1440"/>
+        </w:tabs>
+        <w:ind w:left="1440" w:hanging="360"/>
+      </w:pPr>
+      <w:rPr>
+        <w:rFonts w:ascii="Courier New" w:hAnsi="Courier New" w:hint="default"/>
+        <w:sz w:val="20"/>
+      </w:rPr>
+    </w:lvl>
+    <w:lvl w:ilvl="2" w:tentative="1">
+      <w:start w:val="1"/>
+      <w:numFmt w:val="bullet"/>
+      <w:lvlText w:val=""/>
+      <w:lvlJc w:val="left"/>
+      <w:pPr>
+        <w:tabs>
+          <w:tab w:val="num" w:pos="2160"/>
+        </w:tabs>
+        <w:ind w:left="2160" w:hanging="360"/>
+      </w:pPr>
+      <w:rPr>
+        <w:rFonts w:ascii="Wingdings" w:hAnsi="Wingdings" w:hint="default"/>
+        <w:sz w:val="20"/>
+      </w:rPr>
+    </w:lvl>
+    <w:lvl w:ilvl="3" w:tentative="1">
+      <w:start w:val="1"/>
+      <w:numFmt w:val="bullet"/>
+      <w:lvlText w:val=""/>
+      <w:lvlJc w:val="left"/>
+      <w:pPr>
+        <w:tabs>
+          <w:tab w:val="num" w:pos="2880"/>
+        </w:tabs>
+        <w:ind w:left="2880" w:hanging="360"/>
+      </w:pPr>
+      <w:rPr>
+        <w:rFonts w:ascii="Wingdings" w:hAnsi="Wingdings" w:hint="default"/>
+        <w:sz w:val="20"/>
+      </w:rPr>
+    </w:lvl>
+    <w:lvl w:ilvl="4" w:tentative="1">
+      <w:start w:val="1"/>
+      <w:numFmt w:val="bullet"/>
+      <w:lvlText w:val=""/>
+      <w:lvlJc w:val="left"/>
+      <w:pPr>
+        <w:tabs>
+          <w:tab w:val="num" w:pos="3600"/>
+        </w:tabs>
+        <w:ind w:left="3600" w:hanging="360"/>
+      </w:pPr>
+      <w:rPr>
+        <w:rFonts w:ascii="Wingdings" w:hAnsi="Wingdings" w:hint="default"/>
+        <w:sz w:val="20"/>
+      </w:rPr>
+    </w:lvl>
+    <w:lvl w:ilvl="5" w:tentative="1">
+      <w:start w:val="1"/>
+      <w:numFmt w:val="bullet"/>
+      <w:lvlText w:val=""/>
+      <w:lvlJc w:val="left"/>
+      <w:pPr>
+        <w:tabs>
+          <w:tab w:val="num" w:pos="4320"/>
+        </w:tabs>
+        <w:ind w:left="4320" w:hanging="360"/>
+      </w:pPr>
+      <w:rPr>
+        <w:rFonts w:ascii="Wingdings" w:hAnsi="Wingdings" w:hint="default"/>
+        <w:sz w:val="20"/>
+      </w:rPr>
+    </w:lvl>
+    <w:lvl w:ilvl="6" w:tentative="1">
+      <w:start w:val="1"/>
+      <w:numFmt w:val="bullet"/>
+      <w:lvlText w:val=""/>
+      <w:lvlJc w:val="left"/>
+      <w:pPr>
+        <w:tabs>
+          <w:tab w:val="num" w:pos="5040"/>
+        </w:tabs>
+        <w:ind w:left="5040" w:hanging="360"/>
+      </w:pPr>
+      <w:rPr>
+        <w:rFonts w:ascii="Wingdings" w:hAnsi="Wingdings" w:hint="default"/>
+        <w:sz w:val="20"/>
+      </w:rPr>
+    </w:lvl>
+    <w:lvl w:ilvl="7" w:tentative="1">
+      <w:start w:val="1"/>
+      <w:numFmt w:val="bullet"/>
+      <w:lvlText w:val=""/>
+      <w:lvlJc w:val="left"/>
+      <w:pPr>
+        <w:tabs>
+          <w:tab w:val="num" w:pos="5760"/>
+        </w:tabs>
+        <w:ind w:left="5760" w:hanging="360"/>
+      </w:pPr>
+      <w:rPr>
+        <w:rFonts w:ascii="Wingdings" w:hAnsi="Wingdings" w:hint="default"/>
+        <w:sz w:val="20"/>
+      </w:rPr>
+    </w:lvl>
+    <w:lvl w:ilvl="8" w:tentative="1">
+      <w:start w:val="1"/>
+      <w:numFmt w:val="bullet"/>
+      <w:lvlText w:val=""/>
+      <w:lvlJc w:val="left"/>
+      <w:pPr>
+        <w:tabs>
+          <w:tab w:val="num" w:pos="6480"/>
+        </w:tabs>
+        <w:ind w:left="6480" w:hanging="360"/>
+      </w:pPr>
+      <w:rPr>
+        <w:rFonts w:ascii="Wingdings" w:hAnsi="Wingdings" w:hint="default"/>
+        <w:sz w:val="20"/>
+      </w:rPr>
+    </w:lvl>
+  </w:abstractNum>
+  <w:abstractNum w:abstractNumId="3" w15:restartNumberingAfterBreak="0">
     <w:nsid w:val="25FA2402"/>
     <w:multiLevelType w:val="multilevel"/>
     <w:tmpl w:val="4A8C5648"/>
@@ -9773,7 +13115,120 @@
       </w:rPr>
     </w:lvl>
   </w:abstractNum>
-  <w:abstractNum w:abstractNumId="1" w15:restartNumberingAfterBreak="0">
+  <w:abstractNum w:abstractNumId="4" w15:restartNumberingAfterBreak="0">
+    <w:nsid w:val="33AC009F"/>
+    <w:multiLevelType w:val="multilevel"/>
+    <w:tmpl w:val="041C0CFC"/>
+    <w:lvl w:ilvl="0">
+      <w:start w:val="1"/>
+      <w:numFmt w:val="decimal"/>
+      <w:lvlText w:val="%1."/>
+      <w:lvlJc w:val="left"/>
+      <w:pPr>
+        <w:tabs>
+          <w:tab w:val="num" w:pos="720"/>
+        </w:tabs>
+        <w:ind w:left="720" w:hanging="360"/>
+      </w:pPr>
+    </w:lvl>
+    <w:lvl w:ilvl="1" w:tentative="1">
+      <w:start w:val="1"/>
+      <w:numFmt w:val="decimal"/>
+      <w:lvlText w:val="%2."/>
+      <w:lvlJc w:val="left"/>
+      <w:pPr>
+        <w:tabs>
+          <w:tab w:val="num" w:pos="1440"/>
+        </w:tabs>
+        <w:ind w:left="1440" w:hanging="360"/>
+      </w:pPr>
+    </w:lvl>
+    <w:lvl w:ilvl="2" w:tentative="1">
+      <w:start w:val="1"/>
+      <w:numFmt w:val="decimal"/>
+      <w:lvlText w:val="%3."/>
+      <w:lvlJc w:val="left"/>
+      <w:pPr>
+        <w:tabs>
+          <w:tab w:val="num" w:pos="2160"/>
+        </w:tabs>
+        <w:ind w:left="2160" w:hanging="360"/>
+      </w:pPr>
+    </w:lvl>
+    <w:lvl w:ilvl="3" w:tentative="1">
+      <w:start w:val="1"/>
+      <w:numFmt w:val="decimal"/>
+      <w:lvlText w:val="%4."/>
+      <w:lvlJc w:val="left"/>
+      <w:pPr>
+        <w:tabs>
+          <w:tab w:val="num" w:pos="2880"/>
+        </w:tabs>
+        <w:ind w:left="2880" w:hanging="360"/>
+      </w:pPr>
+    </w:lvl>
+    <w:lvl w:ilvl="4" w:tentative="1">
+      <w:start w:val="1"/>
+      <w:numFmt w:val="decimal"/>
+      <w:lvlText w:val="%5."/>
+      <w:lvlJc w:val="left"/>
+      <w:pPr>
+        <w:tabs>
+          <w:tab w:val="num" w:pos="3600"/>
+        </w:tabs>
+        <w:ind w:left="3600" w:hanging="360"/>
+      </w:pPr>
+    </w:lvl>
+    <w:lvl w:ilvl="5" w:tentative="1">
+      <w:start w:val="1"/>
+      <w:numFmt w:val="decimal"/>
+      <w:lvlText w:val="%6."/>
+      <w:lvlJc w:val="left"/>
+      <w:pPr>
+        <w:tabs>
+          <w:tab w:val="num" w:pos="4320"/>
+        </w:tabs>
+        <w:ind w:left="4320" w:hanging="360"/>
+      </w:pPr>
+    </w:lvl>
+    <w:lvl w:ilvl="6" w:tentative="1">
+      <w:start w:val="1"/>
+      <w:numFmt w:val="decimal"/>
+      <w:lvlText w:val="%7."/>
+      <w:lvlJc w:val="left"/>
+      <w:pPr>
+        <w:tabs>
+          <w:tab w:val="num" w:pos="5040"/>
+        </w:tabs>
+        <w:ind w:left="5040" w:hanging="360"/>
+      </w:pPr>
+    </w:lvl>
+    <w:lvl w:ilvl="7" w:tentative="1">
+      <w:start w:val="1"/>
+      <w:numFmt w:val="decimal"/>
+      <w:lvlText w:val="%8."/>
+      <w:lvlJc w:val="left"/>
+      <w:pPr>
+        <w:tabs>
+          <w:tab w:val="num" w:pos="5760"/>
+        </w:tabs>
+        <w:ind w:left="5760" w:hanging="360"/>
+      </w:pPr>
+    </w:lvl>
+    <w:lvl w:ilvl="8" w:tentative="1">
+      <w:start w:val="1"/>
+      <w:numFmt w:val="decimal"/>
+      <w:lvlText w:val="%9."/>
+      <w:lvlJc w:val="left"/>
+      <w:pPr>
+        <w:tabs>
+          <w:tab w:val="num" w:pos="6480"/>
+        </w:tabs>
+        <w:ind w:left="6480" w:hanging="360"/>
+      </w:pPr>
+    </w:lvl>
+  </w:abstractNum>
+  <w:abstractNum w:abstractNumId="5" w15:restartNumberingAfterBreak="0">
     <w:nsid w:val="37242B24"/>
     <w:multiLevelType w:val="multilevel"/>
     <w:tmpl w:val="8D7AE728"/>
@@ -9922,7 +13377,7 @@
       </w:rPr>
     </w:lvl>
   </w:abstractNum>
-  <w:abstractNum w:abstractNumId="2" w15:restartNumberingAfterBreak="0">
+  <w:abstractNum w:abstractNumId="6" w15:restartNumberingAfterBreak="0">
     <w:nsid w:val="3BA5744C"/>
     <w:multiLevelType w:val="hybridMultilevel"/>
     <w:tmpl w:val="C4466BC6"/>
@@ -10067,7 +13522,7 @@
       </w:rPr>
     </w:lvl>
   </w:abstractNum>
-  <w:abstractNum w:abstractNumId="3" w15:restartNumberingAfterBreak="0">
+  <w:abstractNum w:abstractNumId="7" w15:restartNumberingAfterBreak="0">
     <w:nsid w:val="519C15BF"/>
     <w:multiLevelType w:val="multilevel"/>
     <w:tmpl w:val="CD92F25A"/>
@@ -10216,7 +13671,7 @@
       </w:rPr>
     </w:lvl>
   </w:abstractNum>
-  <w:abstractNum w:abstractNumId="4" w15:restartNumberingAfterBreak="0">
+  <w:abstractNum w:abstractNumId="8" w15:restartNumberingAfterBreak="0">
     <w:nsid w:val="555262AC"/>
     <w:multiLevelType w:val="hybridMultilevel"/>
     <w:tmpl w:val="4A52BB8A"/>
@@ -10361,7 +13816,7 @@
       </w:rPr>
     </w:lvl>
   </w:abstractNum>
-  <w:abstractNum w:abstractNumId="5" w15:restartNumberingAfterBreak="0">
+  <w:abstractNum w:abstractNumId="9" w15:restartNumberingAfterBreak="0">
     <w:nsid w:val="58B0196F"/>
     <w:multiLevelType w:val="hybridMultilevel"/>
     <w:tmpl w:val="EB583A5C"/>
@@ -10506,7 +13961,7 @@
       </w:rPr>
     </w:lvl>
   </w:abstractNum>
-  <w:abstractNum w:abstractNumId="6" w15:restartNumberingAfterBreak="0">
+  <w:abstractNum w:abstractNumId="10" w15:restartNumberingAfterBreak="0">
     <w:nsid w:val="5B324DB3"/>
     <w:multiLevelType w:val="multilevel"/>
     <w:tmpl w:val="1AB4BD7A"/>
@@ -10623,7 +14078,7 @@
       </w:pPr>
     </w:lvl>
   </w:abstractNum>
-  <w:abstractNum w:abstractNumId="7" w15:restartNumberingAfterBreak="0">
+  <w:abstractNum w:abstractNumId="11" w15:restartNumberingAfterBreak="0">
     <w:nsid w:val="5DD863D9"/>
     <w:multiLevelType w:val="multilevel"/>
     <w:tmpl w:val="944E1316"/>
@@ -10740,7 +14195,7 @@
       </w:pPr>
     </w:lvl>
   </w:abstractNum>
-  <w:abstractNum w:abstractNumId="8" w15:restartNumberingAfterBreak="0">
+  <w:abstractNum w:abstractNumId="12" w15:restartNumberingAfterBreak="0">
     <w:nsid w:val="6AA167C7"/>
     <w:multiLevelType w:val="multilevel"/>
     <w:tmpl w:val="2C9A8094"/>
@@ -10889,7 +14344,120 @@
       </w:rPr>
     </w:lvl>
   </w:abstractNum>
-  <w:abstractNum w:abstractNumId="9" w15:restartNumberingAfterBreak="0">
+  <w:abstractNum w:abstractNumId="13" w15:restartNumberingAfterBreak="0">
+    <w:nsid w:val="6AA216BE"/>
+    <w:multiLevelType w:val="multilevel"/>
+    <w:tmpl w:val="5332FFBC"/>
+    <w:lvl w:ilvl="0">
+      <w:start w:val="4"/>
+      <w:numFmt w:val="decimal"/>
+      <w:lvlText w:val="%1."/>
+      <w:lvlJc w:val="left"/>
+      <w:pPr>
+        <w:tabs>
+          <w:tab w:val="num" w:pos="720"/>
+        </w:tabs>
+        <w:ind w:left="720" w:hanging="360"/>
+      </w:pPr>
+    </w:lvl>
+    <w:lvl w:ilvl="1" w:tentative="1">
+      <w:start w:val="1"/>
+      <w:numFmt w:val="decimal"/>
+      <w:lvlText w:val="%2."/>
+      <w:lvlJc w:val="left"/>
+      <w:pPr>
+        <w:tabs>
+          <w:tab w:val="num" w:pos="1440"/>
+        </w:tabs>
+        <w:ind w:left="1440" w:hanging="360"/>
+      </w:pPr>
+    </w:lvl>
+    <w:lvl w:ilvl="2" w:tentative="1">
+      <w:start w:val="1"/>
+      <w:numFmt w:val="decimal"/>
+      <w:lvlText w:val="%3."/>
+      <w:lvlJc w:val="left"/>
+      <w:pPr>
+        <w:tabs>
+          <w:tab w:val="num" w:pos="2160"/>
+        </w:tabs>
+        <w:ind w:left="2160" w:hanging="360"/>
+      </w:pPr>
+    </w:lvl>
+    <w:lvl w:ilvl="3" w:tentative="1">
+      <w:start w:val="1"/>
+      <w:numFmt w:val="decimal"/>
+      <w:lvlText w:val="%4."/>
+      <w:lvlJc w:val="left"/>
+      <w:pPr>
+        <w:tabs>
+          <w:tab w:val="num" w:pos="2880"/>
+        </w:tabs>
+        <w:ind w:left="2880" w:hanging="360"/>
+      </w:pPr>
+    </w:lvl>
+    <w:lvl w:ilvl="4" w:tentative="1">
+      <w:start w:val="1"/>
+      <w:numFmt w:val="decimal"/>
+      <w:lvlText w:val="%5."/>
+      <w:lvlJc w:val="left"/>
+      <w:pPr>
+        <w:tabs>
+          <w:tab w:val="num" w:pos="3600"/>
+        </w:tabs>
+        <w:ind w:left="3600" w:hanging="360"/>
+      </w:pPr>
+    </w:lvl>
+    <w:lvl w:ilvl="5" w:tentative="1">
+      <w:start w:val="1"/>
+      <w:numFmt w:val="decimal"/>
+      <w:lvlText w:val="%6."/>
+      <w:lvlJc w:val="left"/>
+      <w:pPr>
+        <w:tabs>
+          <w:tab w:val="num" w:pos="4320"/>
+        </w:tabs>
+        <w:ind w:left="4320" w:hanging="360"/>
+      </w:pPr>
+    </w:lvl>
+    <w:lvl w:ilvl="6" w:tentative="1">
+      <w:start w:val="1"/>
+      <w:numFmt w:val="decimal"/>
+      <w:lvlText w:val="%7."/>
+      <w:lvlJc w:val="left"/>
+      <w:pPr>
+        <w:tabs>
+          <w:tab w:val="num" w:pos="5040"/>
+        </w:tabs>
+        <w:ind w:left="5040" w:hanging="360"/>
+      </w:pPr>
+    </w:lvl>
+    <w:lvl w:ilvl="7" w:tentative="1">
+      <w:start w:val="1"/>
+      <w:numFmt w:val="decimal"/>
+      <w:lvlText w:val="%8."/>
+      <w:lvlJc w:val="left"/>
+      <w:pPr>
+        <w:tabs>
+          <w:tab w:val="num" w:pos="5760"/>
+        </w:tabs>
+        <w:ind w:left="5760" w:hanging="360"/>
+      </w:pPr>
+    </w:lvl>
+    <w:lvl w:ilvl="8" w:tentative="1">
+      <w:start w:val="1"/>
+      <w:numFmt w:val="decimal"/>
+      <w:lvlText w:val="%9."/>
+      <w:lvlJc w:val="left"/>
+      <w:pPr>
+        <w:tabs>
+          <w:tab w:val="num" w:pos="6480"/>
+        </w:tabs>
+        <w:ind w:left="6480" w:hanging="360"/>
+      </w:pPr>
+    </w:lvl>
+  </w:abstractNum>
+  <w:abstractNum w:abstractNumId="14" w15:restartNumberingAfterBreak="0">
     <w:nsid w:val="6CD8679D"/>
     <w:multiLevelType w:val="multilevel"/>
     <w:tmpl w:val="A4502E16"/>
@@ -11038,7 +14606,120 @@
       </w:rPr>
     </w:lvl>
   </w:abstractNum>
-  <w:abstractNum w:abstractNumId="10" w15:restartNumberingAfterBreak="0">
+  <w:abstractNum w:abstractNumId="15" w15:restartNumberingAfterBreak="0">
+    <w:nsid w:val="71580018"/>
+    <w:multiLevelType w:val="multilevel"/>
+    <w:tmpl w:val="8DCA15A8"/>
+    <w:lvl w:ilvl="0">
+      <w:start w:val="1"/>
+      <w:numFmt w:val="decimal"/>
+      <w:lvlText w:val="%1."/>
+      <w:lvlJc w:val="left"/>
+      <w:pPr>
+        <w:tabs>
+          <w:tab w:val="num" w:pos="720"/>
+        </w:tabs>
+        <w:ind w:left="720" w:hanging="360"/>
+      </w:pPr>
+    </w:lvl>
+    <w:lvl w:ilvl="1" w:tentative="1">
+      <w:start w:val="1"/>
+      <w:numFmt w:val="decimal"/>
+      <w:lvlText w:val="%2."/>
+      <w:lvlJc w:val="left"/>
+      <w:pPr>
+        <w:tabs>
+          <w:tab w:val="num" w:pos="1440"/>
+        </w:tabs>
+        <w:ind w:left="1440" w:hanging="360"/>
+      </w:pPr>
+    </w:lvl>
+    <w:lvl w:ilvl="2" w:tentative="1">
+      <w:start w:val="1"/>
+      <w:numFmt w:val="decimal"/>
+      <w:lvlText w:val="%3."/>
+      <w:lvlJc w:val="left"/>
+      <w:pPr>
+        <w:tabs>
+          <w:tab w:val="num" w:pos="2160"/>
+        </w:tabs>
+        <w:ind w:left="2160" w:hanging="360"/>
+      </w:pPr>
+    </w:lvl>
+    <w:lvl w:ilvl="3" w:tentative="1">
+      <w:start w:val="1"/>
+      <w:numFmt w:val="decimal"/>
+      <w:lvlText w:val="%4."/>
+      <w:lvlJc w:val="left"/>
+      <w:pPr>
+        <w:tabs>
+          <w:tab w:val="num" w:pos="2880"/>
+        </w:tabs>
+        <w:ind w:left="2880" w:hanging="360"/>
+      </w:pPr>
+    </w:lvl>
+    <w:lvl w:ilvl="4" w:tentative="1">
+      <w:start w:val="1"/>
+      <w:numFmt w:val="decimal"/>
+      <w:lvlText w:val="%5."/>
+      <w:lvlJc w:val="left"/>
+      <w:pPr>
+        <w:tabs>
+          <w:tab w:val="num" w:pos="3600"/>
+        </w:tabs>
+        <w:ind w:left="3600" w:hanging="360"/>
+      </w:pPr>
+    </w:lvl>
+    <w:lvl w:ilvl="5" w:tentative="1">
+      <w:start w:val="1"/>
+      <w:numFmt w:val="decimal"/>
+      <w:lvlText w:val="%6."/>
+      <w:lvlJc w:val="left"/>
+      <w:pPr>
+        <w:tabs>
+          <w:tab w:val="num" w:pos="4320"/>
+        </w:tabs>
+        <w:ind w:left="4320" w:hanging="360"/>
+      </w:pPr>
+    </w:lvl>
+    <w:lvl w:ilvl="6" w:tentative="1">
+      <w:start w:val="1"/>
+      <w:numFmt w:val="decimal"/>
+      <w:lvlText w:val="%7."/>
+      <w:lvlJc w:val="left"/>
+      <w:pPr>
+        <w:tabs>
+          <w:tab w:val="num" w:pos="5040"/>
+        </w:tabs>
+        <w:ind w:left="5040" w:hanging="360"/>
+      </w:pPr>
+    </w:lvl>
+    <w:lvl w:ilvl="7" w:tentative="1">
+      <w:start w:val="1"/>
+      <w:numFmt w:val="decimal"/>
+      <w:lvlText w:val="%8."/>
+      <w:lvlJc w:val="left"/>
+      <w:pPr>
+        <w:tabs>
+          <w:tab w:val="num" w:pos="5760"/>
+        </w:tabs>
+        <w:ind w:left="5760" w:hanging="360"/>
+      </w:pPr>
+    </w:lvl>
+    <w:lvl w:ilvl="8" w:tentative="1">
+      <w:start w:val="1"/>
+      <w:numFmt w:val="decimal"/>
+      <w:lvlText w:val="%9."/>
+      <w:lvlJc w:val="left"/>
+      <w:pPr>
+        <w:tabs>
+          <w:tab w:val="num" w:pos="6480"/>
+        </w:tabs>
+        <w:ind w:left="6480" w:hanging="360"/>
+      </w:pPr>
+    </w:lvl>
+  </w:abstractNum>
+  <w:abstractNum w:abstractNumId="16" w15:restartNumberingAfterBreak="0">
     <w:nsid w:val="734447FA"/>
     <w:multiLevelType w:val="hybridMultilevel"/>
     <w:tmpl w:val="F46421CA"/>
@@ -11183,7 +14864,7 @@
       </w:rPr>
     </w:lvl>
   </w:abstractNum>
-  <w:abstractNum w:abstractNumId="11" w15:restartNumberingAfterBreak="0">
+  <w:abstractNum w:abstractNumId="17" w15:restartNumberingAfterBreak="0">
     <w:nsid w:val="74C152B2"/>
     <w:multiLevelType w:val="hybridMultilevel"/>
     <w:tmpl w:val="7498834E"/>
@@ -11328,7 +15009,7 @@
       </w:rPr>
     </w:lvl>
   </w:abstractNum>
-  <w:abstractNum w:abstractNumId="12" w15:restartNumberingAfterBreak="0">
+  <w:abstractNum w:abstractNumId="18" w15:restartNumberingAfterBreak="0">
     <w:nsid w:val="74F23D0E"/>
     <w:multiLevelType w:val="multilevel"/>
     <w:tmpl w:val="ECAE4E68"/>
@@ -11477,7 +15158,7 @@
       </w:rPr>
     </w:lvl>
   </w:abstractNum>
-  <w:abstractNum w:abstractNumId="13" w15:restartNumberingAfterBreak="0">
+  <w:abstractNum w:abstractNumId="19" w15:restartNumberingAfterBreak="0">
     <w:nsid w:val="7BA41823"/>
     <w:multiLevelType w:val="hybridMultilevel"/>
     <w:tmpl w:val="3828C1AA"/>
@@ -11623,46 +15304,64 @@
     </w:lvl>
   </w:abstractNum>
   <w:num w:numId="1" w16cid:durableId="952133176">
+    <w:abstractNumId w:val="14"/>
+  </w:num>
+  <w:num w:numId="2" w16cid:durableId="1166896611">
+    <w:abstractNumId w:val="6"/>
+  </w:num>
+  <w:num w:numId="3" w16cid:durableId="1310670947">
+    <w:abstractNumId w:val="3"/>
+  </w:num>
+  <w:num w:numId="4" w16cid:durableId="680620245">
+    <w:abstractNumId w:val="17"/>
+  </w:num>
+  <w:num w:numId="5" w16cid:durableId="1966615476">
+    <w:abstractNumId w:val="7"/>
+  </w:num>
+  <w:num w:numId="6" w16cid:durableId="392969938">
+    <w:abstractNumId w:val="19"/>
+  </w:num>
+  <w:num w:numId="7" w16cid:durableId="929898505">
+    <w:abstractNumId w:val="10"/>
+  </w:num>
+  <w:num w:numId="8" w16cid:durableId="1276669747">
+    <w:abstractNumId w:val="5"/>
+  </w:num>
+  <w:num w:numId="9" w16cid:durableId="1979188264">
+    <w:abstractNumId w:val="8"/>
+  </w:num>
+  <w:num w:numId="10" w16cid:durableId="107969291">
+    <w:abstractNumId w:val="12"/>
+  </w:num>
+  <w:num w:numId="11" w16cid:durableId="305161546">
     <w:abstractNumId w:val="9"/>
   </w:num>
-  <w:num w:numId="2" w16cid:durableId="1166896611">
-    <w:abstractNumId w:val="2"/>
+  <w:num w:numId="12" w16cid:durableId="989987880">
+    <w:abstractNumId w:val="18"/>
   </w:num>
-  <w:num w:numId="3" w16cid:durableId="1310670947">
+  <w:num w:numId="13" w16cid:durableId="232745312">
+    <w:abstractNumId w:val="16"/>
+  </w:num>
+  <w:num w:numId="14" w16cid:durableId="1168059248">
+    <w:abstractNumId w:val="11"/>
+  </w:num>
+  <w:num w:numId="15" w16cid:durableId="648481576">
+    <w:abstractNumId w:val="15"/>
+  </w:num>
+  <w:num w:numId="16" w16cid:durableId="1210219848">
+    <w:abstractNumId w:val="4"/>
+  </w:num>
+  <w:num w:numId="17" w16cid:durableId="312947345">
     <w:abstractNumId w:val="0"/>
   </w:num>
-  <w:num w:numId="4" w16cid:durableId="680620245">
-    <w:abstractNumId w:val="11"/>
+  <w:num w:numId="18" w16cid:durableId="951325549">
+    <w:abstractNumId w:val="1"/>
   </w:num>
-  <w:num w:numId="5" w16cid:durableId="1966615476">
-    <w:abstractNumId w:val="3"/>
-  </w:num>
-  <w:num w:numId="6" w16cid:durableId="392969938">
+  <w:num w:numId="19" w16cid:durableId="832722783">
     <w:abstractNumId w:val="13"/>
   </w:num>
-  <w:num w:numId="7" w16cid:durableId="929898505">
-    <w:abstractNumId w:val="6"/>
-  </w:num>
-  <w:num w:numId="8" w16cid:durableId="1276669747">
-    <w:abstractNumId w:val="1"/>
-  </w:num>
-  <w:num w:numId="9" w16cid:durableId="1979188264">
-    <w:abstractNumId w:val="4"/>
-  </w:num>
-  <w:num w:numId="10" w16cid:durableId="107969291">
-    <w:abstractNumId w:val="8"/>
-  </w:num>
-  <w:num w:numId="11" w16cid:durableId="305161546">
-    <w:abstractNumId w:val="5"/>
-  </w:num>
-  <w:num w:numId="12" w16cid:durableId="989987880">
-    <w:abstractNumId w:val="12"/>
-  </w:num>
-  <w:num w:numId="13" w16cid:durableId="232745312">
-    <w:abstractNumId w:val="10"/>
-  </w:num>
-  <w:num w:numId="14" w16cid:durableId="1168059248">
-    <w:abstractNumId w:val="7"/>
+  <w:num w:numId="20" w16cid:durableId="1621298433">
+    <w:abstractNumId w:val="2"/>
   </w:num>
 </w:numbering>
 </file>
@@ -12899,4 +16598,16 @@
     </a:ext>
   </a:extLst>
 </a:theme>
+</file>
+
+<file path=customXml/item1.xml><?xml version="1.0" encoding="utf-8"?>
+<b:Sources xmlns:b="http://schemas.openxmlformats.org/officeDocument/2006/bibliography" xmlns="http://schemas.openxmlformats.org/officeDocument/2006/bibliography" SelectedStyle="\APASixthEditionOfficeOnline.xsl" StyleName="APA" Version="6"/>
+</file>
+
+<file path=customXml/itemProps1.xml><?xml version="1.0" encoding="utf-8"?>
+<ds:datastoreItem xmlns:ds="http://schemas.openxmlformats.org/officeDocument/2006/customXml" ds:itemID="{F11A641B-F899-4CD7-A592-6433C3DD8545}">
+  <ds:schemaRefs>
+    <ds:schemaRef ds:uri="http://schemas.openxmlformats.org/officeDocument/2006/bibliography"/>
+  </ds:schemaRefs>
+</ds:datastoreItem>
 </file>
</xml_diff>